<commit_message>
Az admin route-ok és controllerek elkezdése, user és termékek. Egyébb fejlesztések.
A héten befejezem az admin felületet és elkezdjük össze kötni a Backet a Fronttal. Onnantól kezdve folytonos tesztelés és összekötés lesz, amíg minden úgy működik ahogy kell.
</commit_message>
<xml_diff>
--- a/Barbershop 1.0.6/Backend/txt_allomanyok/Végpontok.docx
+++ b/Barbershop 1.0.6/Backend/txt_allomanyok/Végpontok.docx
@@ -6,9 +6,11 @@
       <w:pPr>
         <w:jc w:val="center"/>
       </w:pPr>
+      <w:proofErr w:type="spellStart"/>
       <w:r>
         <w:t>Végpontok</w:t>
       </w:r>
+      <w:proofErr w:type="spellEnd"/>
     </w:p>
     <w:tbl>
       <w:tblPr>
@@ -28,9 +30,11 @@
             <w:tcW w:w="2337" w:type="dxa"/>
           </w:tcPr>
           <w:p>
+            <w:proofErr w:type="spellStart"/>
             <w:r>
               <w:t>Végpont</w:t>
             </w:r>
+            <w:proofErr w:type="spellEnd"/>
           </w:p>
         </w:tc>
         <w:tc>
@@ -38,9 +42,11 @@
             <w:tcW w:w="2337" w:type="dxa"/>
           </w:tcPr>
           <w:p>
+            <w:proofErr w:type="spellStart"/>
             <w:r>
               <w:t>Lekérdés</w:t>
             </w:r>
+            <w:proofErr w:type="spellEnd"/>
           </w:p>
         </w:tc>
         <w:tc>
@@ -48,9 +54,11 @@
             <w:tcW w:w="2338" w:type="dxa"/>
           </w:tcPr>
           <w:p>
+            <w:proofErr w:type="spellStart"/>
             <w:r>
               <w:t>Funkció</w:t>
             </w:r>
+            <w:proofErr w:type="spellEnd"/>
           </w:p>
         </w:tc>
         <w:tc>
@@ -58,9 +66,11 @@
             <w:tcW w:w="2338" w:type="dxa"/>
           </w:tcPr>
           <w:p>
+            <w:proofErr w:type="spellStart"/>
             <w:r>
               <w:t>Státuszkód</w:t>
             </w:r>
+            <w:proofErr w:type="spellEnd"/>
           </w:p>
         </w:tc>
       </w:tr>
@@ -71,8 +81,13 @@
           </w:tcPr>
           <w:p>
             <w:r>
-              <w:t>/register</w:t>
-            </w:r>
+              <w:t>/</w:t>
+            </w:r>
+            <w:proofErr w:type="gramStart"/>
+            <w:r>
+              <w:t>register</w:t>
+            </w:r>
+            <w:proofErr w:type="gramEnd"/>
           </w:p>
         </w:tc>
         <w:tc>
@@ -90,16 +105,333 @@
             <w:tcW w:w="2338" w:type="dxa"/>
           </w:tcPr>
           <w:p>
-            <w:r>
-              <w:t xml:space="preserve">Bekér egy Nevet, egy emailt és egy jelszót. Ezeket utána elküldi a Backendre, ahol ellenőrzi, hogy van-e felhasználó gmail-el. Utána ellenőrzi, hogy </w:t>
-            </w:r>
-            <w:r>
-              <w:t>a jelszó nem admin jelszó, ha admin jelszó, akkor egy admint regisztrál, de csak 1 lehet az adatbázisban.</w:t>
+            <w:proofErr w:type="spellStart"/>
+            <w:r>
+              <w:t>Bekér</w:t>
+            </w:r>
+            <w:proofErr w:type="spellEnd"/>
+            <w:r>
+              <w:t xml:space="preserve"> </w:t>
+            </w:r>
+            <w:proofErr w:type="spellStart"/>
+            <w:r>
+              <w:t>egy</w:t>
+            </w:r>
+            <w:proofErr w:type="spellEnd"/>
+            <w:r>
+              <w:t xml:space="preserve"> Nevet, </w:t>
+            </w:r>
+            <w:proofErr w:type="spellStart"/>
+            <w:r>
+              <w:t>egy</w:t>
+            </w:r>
+            <w:proofErr w:type="spellEnd"/>
+            <w:r>
+              <w:t xml:space="preserve"> </w:t>
+            </w:r>
+            <w:proofErr w:type="spellStart"/>
+            <w:r>
+              <w:t>emailt</w:t>
+            </w:r>
+            <w:proofErr w:type="spellEnd"/>
+            <w:r>
+              <w:t xml:space="preserve"> </w:t>
+            </w:r>
+            <w:proofErr w:type="spellStart"/>
+            <w:r>
+              <w:t>és</w:t>
+            </w:r>
+            <w:proofErr w:type="spellEnd"/>
+            <w:r>
+              <w:t xml:space="preserve"> </w:t>
+            </w:r>
+            <w:proofErr w:type="spellStart"/>
+            <w:r>
+              <w:t>egy</w:t>
+            </w:r>
+            <w:proofErr w:type="spellEnd"/>
+            <w:r>
+              <w:t xml:space="preserve"> </w:t>
+            </w:r>
+            <w:proofErr w:type="spellStart"/>
+            <w:r>
+              <w:t>jelszót</w:t>
+            </w:r>
+            <w:proofErr w:type="spellEnd"/>
+            <w:r>
+              <w:t xml:space="preserve">. </w:t>
+            </w:r>
+            <w:proofErr w:type="spellStart"/>
+            <w:r>
+              <w:t>Ezeket</w:t>
+            </w:r>
+            <w:proofErr w:type="spellEnd"/>
+            <w:r>
+              <w:t xml:space="preserve"> </w:t>
+            </w:r>
+            <w:proofErr w:type="spellStart"/>
+            <w:r>
+              <w:t>utána</w:t>
+            </w:r>
+            <w:proofErr w:type="spellEnd"/>
+            <w:r>
+              <w:t xml:space="preserve"> </w:t>
+            </w:r>
+            <w:proofErr w:type="spellStart"/>
+            <w:r>
+              <w:t>elküldi</w:t>
+            </w:r>
+            <w:proofErr w:type="spellEnd"/>
+            <w:r>
+              <w:t xml:space="preserve"> a </w:t>
+            </w:r>
+            <w:proofErr w:type="spellStart"/>
+            <w:r>
+              <w:t>Backendre</w:t>
+            </w:r>
+            <w:proofErr w:type="spellEnd"/>
+            <w:r>
+              <w:t xml:space="preserve">, </w:t>
+            </w:r>
+            <w:proofErr w:type="spellStart"/>
+            <w:r>
+              <w:t>ahol</w:t>
+            </w:r>
+            <w:proofErr w:type="spellEnd"/>
+            <w:r>
+              <w:t xml:space="preserve"> </w:t>
+            </w:r>
+            <w:proofErr w:type="spellStart"/>
+            <w:r>
+              <w:t>ellenőrzi</w:t>
+            </w:r>
+            <w:proofErr w:type="spellEnd"/>
+            <w:r>
+              <w:t xml:space="preserve">, </w:t>
+            </w:r>
+            <w:proofErr w:type="spellStart"/>
+            <w:r>
+              <w:t>hogy</w:t>
+            </w:r>
+            <w:proofErr w:type="spellEnd"/>
+            <w:r>
+              <w:t xml:space="preserve"> van-e </w:t>
+            </w:r>
+            <w:proofErr w:type="spellStart"/>
+            <w:r>
+              <w:t>felhasználó</w:t>
+            </w:r>
+            <w:proofErr w:type="spellEnd"/>
+            <w:r>
+              <w:t xml:space="preserve"> </w:t>
+            </w:r>
+            <w:proofErr w:type="spellStart"/>
+            <w:r>
+              <w:t>gmail</w:t>
+            </w:r>
+            <w:proofErr w:type="spellEnd"/>
+            <w:r>
+              <w:t xml:space="preserve">-el. </w:t>
+            </w:r>
+            <w:proofErr w:type="spellStart"/>
+            <w:r>
+              <w:t>Utána</w:t>
+            </w:r>
+            <w:proofErr w:type="spellEnd"/>
+            <w:r>
+              <w:t xml:space="preserve"> </w:t>
+            </w:r>
+            <w:proofErr w:type="spellStart"/>
+            <w:r>
+              <w:t>ellenőrzi</w:t>
+            </w:r>
+            <w:proofErr w:type="spellEnd"/>
+            <w:r>
+              <w:t xml:space="preserve">, </w:t>
+            </w:r>
+            <w:proofErr w:type="spellStart"/>
+            <w:r>
+              <w:t>hogy</w:t>
+            </w:r>
+            <w:proofErr w:type="spellEnd"/>
+            <w:r>
+              <w:t xml:space="preserve"> </w:t>
+            </w:r>
+            <w:r>
+              <w:t xml:space="preserve">a </w:t>
+            </w:r>
+            <w:proofErr w:type="spellStart"/>
+            <w:r>
+              <w:t>jelszó</w:t>
+            </w:r>
+            <w:proofErr w:type="spellEnd"/>
+            <w:r>
+              <w:t xml:space="preserve"> </w:t>
+            </w:r>
+            <w:proofErr w:type="spellStart"/>
+            <w:r>
+              <w:t>nem</w:t>
+            </w:r>
+            <w:proofErr w:type="spellEnd"/>
+            <w:r>
+              <w:t xml:space="preserve"> admin </w:t>
+            </w:r>
+            <w:proofErr w:type="spellStart"/>
+            <w:r>
+              <w:t>jelszó</w:t>
+            </w:r>
+            <w:proofErr w:type="spellEnd"/>
+            <w:r>
+              <w:t xml:space="preserve">, ha admin </w:t>
+            </w:r>
+            <w:proofErr w:type="spellStart"/>
+            <w:r>
+              <w:t>jelszó</w:t>
+            </w:r>
+            <w:proofErr w:type="spellEnd"/>
+            <w:r>
+              <w:t xml:space="preserve">, </w:t>
+            </w:r>
+            <w:proofErr w:type="spellStart"/>
+            <w:r>
+              <w:t>akkor</w:t>
+            </w:r>
+            <w:proofErr w:type="spellEnd"/>
+            <w:r>
+              <w:t xml:space="preserve"> </w:t>
+            </w:r>
+            <w:proofErr w:type="spellStart"/>
+            <w:r>
+              <w:t>egy</w:t>
+            </w:r>
+            <w:proofErr w:type="spellEnd"/>
+            <w:r>
+              <w:t xml:space="preserve"> </w:t>
+            </w:r>
+            <w:proofErr w:type="spellStart"/>
+            <w:r>
+              <w:t>admint</w:t>
+            </w:r>
+            <w:proofErr w:type="spellEnd"/>
+            <w:r>
+              <w:t xml:space="preserve"> </w:t>
+            </w:r>
+            <w:proofErr w:type="spellStart"/>
+            <w:r>
+              <w:t>regisztrál</w:t>
+            </w:r>
+            <w:proofErr w:type="spellEnd"/>
+            <w:r>
+              <w:t xml:space="preserve">, de </w:t>
+            </w:r>
+            <w:proofErr w:type="spellStart"/>
+            <w:r>
+              <w:t>csak</w:t>
+            </w:r>
+            <w:proofErr w:type="spellEnd"/>
+            <w:r>
+              <w:t xml:space="preserve"> 1 </w:t>
+            </w:r>
+            <w:proofErr w:type="spellStart"/>
+            <w:r>
+              <w:t>lehet</w:t>
+            </w:r>
+            <w:proofErr w:type="spellEnd"/>
+            <w:r>
+              <w:t xml:space="preserve"> </w:t>
+            </w:r>
+            <w:proofErr w:type="spellStart"/>
+            <w:r>
+              <w:t>az</w:t>
+            </w:r>
+            <w:proofErr w:type="spellEnd"/>
+            <w:r>
+              <w:t xml:space="preserve"> </w:t>
+            </w:r>
+            <w:proofErr w:type="spellStart"/>
+            <w:r>
+              <w:t>adatbázisban</w:t>
+            </w:r>
+            <w:proofErr w:type="spellEnd"/>
+            <w:r>
+              <w:t>.</w:t>
             </w:r>
           </w:p>
           <w:p>
             <w:r>
-              <w:t>Ha viszont nem admin jelszó, akkor regisztrálja Fogyasztó-ként és azonal bedobja a profilba.</w:t>
+              <w:t xml:space="preserve">Ha </w:t>
+            </w:r>
+            <w:proofErr w:type="spellStart"/>
+            <w:r>
+              <w:t>viszont</w:t>
+            </w:r>
+            <w:proofErr w:type="spellEnd"/>
+            <w:r>
+              <w:t xml:space="preserve"> </w:t>
+            </w:r>
+            <w:proofErr w:type="spellStart"/>
+            <w:r>
+              <w:t>nem</w:t>
+            </w:r>
+            <w:proofErr w:type="spellEnd"/>
+            <w:r>
+              <w:t xml:space="preserve"> admin </w:t>
+            </w:r>
+            <w:proofErr w:type="spellStart"/>
+            <w:r>
+              <w:t>jelszó</w:t>
+            </w:r>
+            <w:proofErr w:type="spellEnd"/>
+            <w:r>
+              <w:t xml:space="preserve">, </w:t>
+            </w:r>
+            <w:proofErr w:type="spellStart"/>
+            <w:r>
+              <w:t>akkor</w:t>
+            </w:r>
+            <w:proofErr w:type="spellEnd"/>
+            <w:r>
+              <w:t xml:space="preserve"> </w:t>
+            </w:r>
+            <w:proofErr w:type="spellStart"/>
+            <w:r>
+              <w:t>regisztrálja</w:t>
+            </w:r>
+            <w:proofErr w:type="spellEnd"/>
+            <w:r>
+              <w:t xml:space="preserve"> </w:t>
+            </w:r>
+            <w:proofErr w:type="spellStart"/>
+            <w:r>
+              <w:t>Fogyasztó-ként</w:t>
+            </w:r>
+            <w:proofErr w:type="spellEnd"/>
+            <w:r>
+              <w:t xml:space="preserve"> </w:t>
+            </w:r>
+            <w:proofErr w:type="spellStart"/>
+            <w:r>
+              <w:t>és</w:t>
+            </w:r>
+            <w:proofErr w:type="spellEnd"/>
+            <w:r>
+              <w:t xml:space="preserve"> azonal </w:t>
+            </w:r>
+            <w:proofErr w:type="spellStart"/>
+            <w:r>
+              <w:t>bedobja</w:t>
+            </w:r>
+            <w:proofErr w:type="spellEnd"/>
+            <w:r>
+              <w:t xml:space="preserve"> a </w:t>
+            </w:r>
+            <w:proofErr w:type="spellStart"/>
+            <w:r>
+              <w:t>profilba</w:t>
+            </w:r>
+            <w:proofErr w:type="spellEnd"/>
+            <w:r>
+              <w:t>.</w:t>
             </w:r>
           </w:p>
         </w:tc>
@@ -109,25 +441,121 @@
           </w:tcPr>
           <w:p>
             <w:r>
-              <w:t>400: Valamelyik mező nincs kitöltve.</w:t>
+              <w:t xml:space="preserve">400: </w:t>
+            </w:r>
+            <w:proofErr w:type="spellStart"/>
+            <w:r>
+              <w:t>Valamelyik</w:t>
+            </w:r>
+            <w:proofErr w:type="spellEnd"/>
+            <w:r>
+              <w:t xml:space="preserve"> </w:t>
+            </w:r>
+            <w:proofErr w:type="spellStart"/>
+            <w:r>
+              <w:t>mező</w:t>
+            </w:r>
+            <w:proofErr w:type="spellEnd"/>
+            <w:r>
+              <w:t xml:space="preserve"> </w:t>
+            </w:r>
+            <w:proofErr w:type="spellStart"/>
+            <w:r>
+              <w:t>nincs</w:t>
+            </w:r>
+            <w:proofErr w:type="spellEnd"/>
+            <w:r>
+              <w:t xml:space="preserve"> </w:t>
+            </w:r>
+            <w:proofErr w:type="spellStart"/>
+            <w:r>
+              <w:t>kitöltve</w:t>
+            </w:r>
+            <w:proofErr w:type="spellEnd"/>
+            <w:r>
+              <w:t>.</w:t>
             </w:r>
           </w:p>
           <w:p/>
           <w:p>
             <w:r>
-              <w:t>409: Már van ilyen email-el rendelkező fiók.</w:t>
+              <w:t xml:space="preserve">409: Már van </w:t>
+            </w:r>
+            <w:proofErr w:type="spellStart"/>
+            <w:r>
+              <w:t>ilyen</w:t>
+            </w:r>
+            <w:proofErr w:type="spellEnd"/>
+            <w:r>
+              <w:t xml:space="preserve"> email-</w:t>
+            </w:r>
+            <w:proofErr w:type="spellStart"/>
+            <w:r>
+              <w:t>el</w:t>
+            </w:r>
+            <w:proofErr w:type="spellEnd"/>
+            <w:r>
+              <w:t xml:space="preserve"> </w:t>
+            </w:r>
+            <w:proofErr w:type="spellStart"/>
+            <w:r>
+              <w:t>rendelkező</w:t>
+            </w:r>
+            <w:proofErr w:type="spellEnd"/>
+            <w:r>
+              <w:t xml:space="preserve"> </w:t>
+            </w:r>
+            <w:proofErr w:type="spellStart"/>
+            <w:r>
+              <w:t>fiók</w:t>
+            </w:r>
+            <w:proofErr w:type="spellEnd"/>
+            <w:r>
+              <w:t>.</w:t>
             </w:r>
           </w:p>
           <w:p/>
           <w:p>
             <w:r>
-              <w:t>201: Sikeres regisztráció.</w:t>
+              <w:t xml:space="preserve">201: </w:t>
+            </w:r>
+            <w:proofErr w:type="spellStart"/>
+            <w:r>
+              <w:t>Sikeres</w:t>
+            </w:r>
+            <w:proofErr w:type="spellEnd"/>
+            <w:r>
+              <w:t xml:space="preserve"> </w:t>
+            </w:r>
+            <w:proofErr w:type="spellStart"/>
+            <w:r>
+              <w:t>regisztráció</w:t>
+            </w:r>
+            <w:proofErr w:type="spellEnd"/>
+            <w:r>
+              <w:t>.</w:t>
             </w:r>
           </w:p>
           <w:p/>
           <w:p>
             <w:r>
-              <w:t>500: Szerver hiba.</w:t>
+              <w:t xml:space="preserve">500: </w:t>
+            </w:r>
+            <w:proofErr w:type="spellStart"/>
+            <w:r>
+              <w:t>Szerver</w:t>
+            </w:r>
+            <w:proofErr w:type="spellEnd"/>
+            <w:r>
+              <w:t xml:space="preserve"> </w:t>
+            </w:r>
+            <w:proofErr w:type="spellStart"/>
+            <w:r>
+              <w:t>hiba</w:t>
+            </w:r>
+            <w:proofErr w:type="spellEnd"/>
+            <w:r>
+              <w:t>.</w:t>
             </w:r>
           </w:p>
         </w:tc>
@@ -139,8 +567,13 @@
           </w:tcPr>
           <w:p>
             <w:r>
-              <w:t>/login</w:t>
-            </w:r>
+              <w:t>/</w:t>
+            </w:r>
+            <w:proofErr w:type="gramStart"/>
+            <w:r>
+              <w:t>login</w:t>
+            </w:r>
+            <w:proofErr w:type="gramEnd"/>
           </w:p>
         </w:tc>
         <w:tc>
@@ -158,8 +591,117 @@
             <w:tcW w:w="2338" w:type="dxa"/>
           </w:tcPr>
           <w:p>
-            <w:r>
-              <w:t>Bekéri egy meglévő felhasználó email-jét és jelszavát. Ha a megfelelő adatok lettek megadva, akkor bejelentkezik a profilba.</w:t>
+            <w:proofErr w:type="spellStart"/>
+            <w:r>
+              <w:t>Bekéri</w:t>
+            </w:r>
+            <w:proofErr w:type="spellEnd"/>
+            <w:r>
+              <w:t xml:space="preserve"> </w:t>
+            </w:r>
+            <w:proofErr w:type="spellStart"/>
+            <w:r>
+              <w:t>egy</w:t>
+            </w:r>
+            <w:proofErr w:type="spellEnd"/>
+            <w:r>
+              <w:t xml:space="preserve"> </w:t>
+            </w:r>
+            <w:proofErr w:type="spellStart"/>
+            <w:r>
+              <w:t>meglévő</w:t>
+            </w:r>
+            <w:proofErr w:type="spellEnd"/>
+            <w:r>
+              <w:t xml:space="preserve"> </w:t>
+            </w:r>
+            <w:proofErr w:type="spellStart"/>
+            <w:r>
+              <w:t>felhasználó</w:t>
+            </w:r>
+            <w:proofErr w:type="spellEnd"/>
+            <w:r>
+              <w:t xml:space="preserve"> email-</w:t>
+            </w:r>
+            <w:proofErr w:type="spellStart"/>
+            <w:r>
+              <w:t>jét</w:t>
+            </w:r>
+            <w:proofErr w:type="spellEnd"/>
+            <w:r>
+              <w:t xml:space="preserve"> </w:t>
+            </w:r>
+            <w:proofErr w:type="spellStart"/>
+            <w:r>
+              <w:t>és</w:t>
+            </w:r>
+            <w:proofErr w:type="spellEnd"/>
+            <w:r>
+              <w:t xml:space="preserve"> </w:t>
+            </w:r>
+            <w:proofErr w:type="spellStart"/>
+            <w:r>
+              <w:t>jelszavát</w:t>
+            </w:r>
+            <w:proofErr w:type="spellEnd"/>
+            <w:r>
+              <w:t xml:space="preserve">. Ha a </w:t>
+            </w:r>
+            <w:proofErr w:type="spellStart"/>
+            <w:r>
+              <w:t>megfelelő</w:t>
+            </w:r>
+            <w:proofErr w:type="spellEnd"/>
+            <w:r>
+              <w:t xml:space="preserve"> </w:t>
+            </w:r>
+            <w:proofErr w:type="spellStart"/>
+            <w:r>
+              <w:t>adatok</w:t>
+            </w:r>
+            <w:proofErr w:type="spellEnd"/>
+            <w:r>
+              <w:t xml:space="preserve"> </w:t>
+            </w:r>
+            <w:proofErr w:type="spellStart"/>
+            <w:r>
+              <w:t>lettek</w:t>
+            </w:r>
+            <w:proofErr w:type="spellEnd"/>
+            <w:r>
+              <w:t xml:space="preserve"> </w:t>
+            </w:r>
+            <w:proofErr w:type="spellStart"/>
+            <w:r>
+              <w:t>megadva</w:t>
+            </w:r>
+            <w:proofErr w:type="spellEnd"/>
+            <w:r>
+              <w:t xml:space="preserve">, </w:t>
+            </w:r>
+            <w:proofErr w:type="spellStart"/>
+            <w:r>
+              <w:t>akkor</w:t>
+            </w:r>
+            <w:proofErr w:type="spellEnd"/>
+            <w:r>
+              <w:t xml:space="preserve"> </w:t>
+            </w:r>
+            <w:proofErr w:type="spellStart"/>
+            <w:r>
+              <w:t>bejelentkezik</w:t>
+            </w:r>
+            <w:proofErr w:type="spellEnd"/>
+            <w:r>
+              <w:t xml:space="preserve"> a </w:t>
+            </w:r>
+            <w:proofErr w:type="spellStart"/>
+            <w:r>
+              <w:t>profilba</w:t>
+            </w:r>
+            <w:proofErr w:type="spellEnd"/>
+            <w:r>
+              <w:t>.</w:t>
             </w:r>
           </w:p>
         </w:tc>
@@ -169,25 +711,113 @@
           </w:tcPr>
           <w:p>
             <w:r>
-              <w:t>400: Valamelyik mező nincs kitöltve.</w:t>
+              <w:t xml:space="preserve">400: </w:t>
+            </w:r>
+            <w:proofErr w:type="spellStart"/>
+            <w:r>
+              <w:t>Valamelyik</w:t>
+            </w:r>
+            <w:proofErr w:type="spellEnd"/>
+            <w:r>
+              <w:t xml:space="preserve"> </w:t>
+            </w:r>
+            <w:proofErr w:type="spellStart"/>
+            <w:r>
+              <w:t>mező</w:t>
+            </w:r>
+            <w:proofErr w:type="spellEnd"/>
+            <w:r>
+              <w:t xml:space="preserve"> </w:t>
+            </w:r>
+            <w:proofErr w:type="spellStart"/>
+            <w:r>
+              <w:t>nincs</w:t>
+            </w:r>
+            <w:proofErr w:type="spellEnd"/>
+            <w:r>
+              <w:t xml:space="preserve"> </w:t>
+            </w:r>
+            <w:proofErr w:type="spellStart"/>
+            <w:r>
+              <w:t>kitöltve</w:t>
+            </w:r>
+            <w:proofErr w:type="spellEnd"/>
+            <w:r>
+              <w:t>.</w:t>
             </w:r>
           </w:p>
           <w:p/>
           <w:p>
             <w:r>
-              <w:t>401: Hibás email vagy jelszó.</w:t>
+              <w:t xml:space="preserve">401: </w:t>
+            </w:r>
+            <w:proofErr w:type="spellStart"/>
+            <w:r>
+              <w:t>Hibás</w:t>
+            </w:r>
+            <w:proofErr w:type="spellEnd"/>
+            <w:r>
+              <w:t xml:space="preserve"> email </w:t>
+            </w:r>
+            <w:proofErr w:type="spellStart"/>
+            <w:r>
+              <w:t>vagy</w:t>
+            </w:r>
+            <w:proofErr w:type="spellEnd"/>
+            <w:r>
+              <w:t xml:space="preserve"> </w:t>
+            </w:r>
+            <w:proofErr w:type="spellStart"/>
+            <w:r>
+              <w:t>jelszó</w:t>
+            </w:r>
+            <w:proofErr w:type="spellEnd"/>
+            <w:r>
+              <w:t>.</w:t>
             </w:r>
           </w:p>
           <w:p/>
           <w:p>
             <w:r>
-              <w:t>200: Sikeres bejelentkezés.</w:t>
+              <w:t xml:space="preserve">200: </w:t>
+            </w:r>
+            <w:proofErr w:type="spellStart"/>
+            <w:r>
+              <w:t>Sikeres</w:t>
+            </w:r>
+            <w:proofErr w:type="spellEnd"/>
+            <w:r>
+              <w:t xml:space="preserve"> </w:t>
+            </w:r>
+            <w:proofErr w:type="spellStart"/>
+            <w:r>
+              <w:t>bejelentkezés</w:t>
+            </w:r>
+            <w:proofErr w:type="spellEnd"/>
+            <w:r>
+              <w:t>.</w:t>
             </w:r>
           </w:p>
           <w:p/>
           <w:p>
             <w:r>
-              <w:t>500: Szerver hiba.</w:t>
+              <w:t xml:space="preserve">500: </w:t>
+            </w:r>
+            <w:proofErr w:type="spellStart"/>
+            <w:r>
+              <w:t>Szerver</w:t>
+            </w:r>
+            <w:proofErr w:type="spellEnd"/>
+            <w:r>
+              <w:t xml:space="preserve"> </w:t>
+            </w:r>
+            <w:proofErr w:type="spellStart"/>
+            <w:r>
+              <w:t>hiba</w:t>
+            </w:r>
+            <w:proofErr w:type="spellEnd"/>
+            <w:r>
+              <w:t>.</w:t>
             </w:r>
           </w:p>
         </w:tc>
@@ -199,8 +829,13 @@
           </w:tcPr>
           <w:p>
             <w:r>
-              <w:t>/logout</w:t>
-            </w:r>
+              <w:t>/</w:t>
+            </w:r>
+            <w:proofErr w:type="gramStart"/>
+            <w:r>
+              <w:t>logout</w:t>
+            </w:r>
+            <w:proofErr w:type="gramEnd"/>
           </w:p>
         </w:tc>
         <w:tc>
@@ -218,20 +853,179 @@
             <w:tcW w:w="2338" w:type="dxa"/>
           </w:tcPr>
           <w:p>
-            <w:r>
-              <w:t>Mindenek előtt ellenőrzi, hogy be van-e lépve, ha nem, akkor ki írja hogy már ki van jelentkezve.</w:t>
+            <w:proofErr w:type="spellStart"/>
+            <w:r>
+              <w:t>Mindenek</w:t>
+            </w:r>
+            <w:proofErr w:type="spellEnd"/>
+            <w:r>
+              <w:t xml:space="preserve"> </w:t>
+            </w:r>
+            <w:proofErr w:type="spellStart"/>
+            <w:r>
+              <w:t>előtt</w:t>
+            </w:r>
+            <w:proofErr w:type="spellEnd"/>
+            <w:r>
+              <w:t xml:space="preserve"> </w:t>
+            </w:r>
+            <w:proofErr w:type="spellStart"/>
+            <w:r>
+              <w:t>ellenőrzi</w:t>
+            </w:r>
+            <w:proofErr w:type="spellEnd"/>
+            <w:r>
+              <w:t xml:space="preserve">, </w:t>
+            </w:r>
+            <w:proofErr w:type="spellStart"/>
+            <w:r>
+              <w:t>hogy</w:t>
+            </w:r>
+            <w:proofErr w:type="spellEnd"/>
+            <w:r>
+              <w:t xml:space="preserve"> be van-e </w:t>
+            </w:r>
+            <w:proofErr w:type="spellStart"/>
+            <w:r>
+              <w:t>lépve</w:t>
+            </w:r>
+            <w:proofErr w:type="spellEnd"/>
+            <w:r>
+              <w:t xml:space="preserve">, ha </w:t>
+            </w:r>
+            <w:proofErr w:type="spellStart"/>
+            <w:r>
+              <w:t>nem</w:t>
+            </w:r>
+            <w:proofErr w:type="spellEnd"/>
+            <w:r>
+              <w:t xml:space="preserve">, </w:t>
+            </w:r>
+            <w:proofErr w:type="spellStart"/>
+            <w:r>
+              <w:t>akkor</w:t>
+            </w:r>
+            <w:proofErr w:type="spellEnd"/>
+            <w:r>
+              <w:t xml:space="preserve"> ki </w:t>
+            </w:r>
+            <w:proofErr w:type="spellStart"/>
+            <w:r>
+              <w:t>írja</w:t>
+            </w:r>
+            <w:proofErr w:type="spellEnd"/>
+            <w:r>
+              <w:t xml:space="preserve"> </w:t>
+            </w:r>
+            <w:proofErr w:type="spellStart"/>
+            <w:r>
+              <w:t>hogy</w:t>
+            </w:r>
+            <w:proofErr w:type="spellEnd"/>
+            <w:r>
+              <w:t xml:space="preserve"> </w:t>
+            </w:r>
+            <w:proofErr w:type="spellStart"/>
+            <w:r>
+              <w:t>már</w:t>
+            </w:r>
+            <w:proofErr w:type="spellEnd"/>
+            <w:r>
+              <w:t xml:space="preserve"> ki van </w:t>
+            </w:r>
+            <w:proofErr w:type="spellStart"/>
+            <w:r>
+              <w:t>jelentkezve</w:t>
+            </w:r>
+            <w:proofErr w:type="spellEnd"/>
+            <w:r>
+              <w:t>.</w:t>
             </w:r>
           </w:p>
           <w:p>
             <w:r>
-              <w:t xml:space="preserve">Ha egy felhasználó be van lépve és </w:t>
-            </w:r>
-            <w:r>
-              <w:t xml:space="preserve">megnyomja a kijelentkezés gombot, akkor </w:t>
-            </w:r>
+              <w:t xml:space="preserve">Ha </w:t>
+            </w:r>
+            <w:proofErr w:type="spellStart"/>
+            <w:r>
+              <w:t>egy</w:t>
+            </w:r>
+            <w:proofErr w:type="spellEnd"/>
+            <w:r>
+              <w:t xml:space="preserve"> </w:t>
+            </w:r>
+            <w:proofErr w:type="spellStart"/>
+            <w:r>
+              <w:t>felhasználó</w:t>
+            </w:r>
+            <w:proofErr w:type="spellEnd"/>
+            <w:r>
+              <w:t xml:space="preserve"> be van </w:t>
+            </w:r>
+            <w:proofErr w:type="spellStart"/>
+            <w:r>
+              <w:t>lépve</w:t>
+            </w:r>
+            <w:proofErr w:type="spellEnd"/>
+            <w:r>
+              <w:t xml:space="preserve"> </w:t>
+            </w:r>
+            <w:proofErr w:type="spellStart"/>
+            <w:r>
+              <w:t>és</w:t>
+            </w:r>
+            <w:proofErr w:type="spellEnd"/>
+            <w:r>
+              <w:t xml:space="preserve"> </w:t>
+            </w:r>
+            <w:proofErr w:type="spellStart"/>
+            <w:r>
+              <w:t>megnyomja</w:t>
+            </w:r>
+            <w:proofErr w:type="spellEnd"/>
+            <w:r>
+              <w:t xml:space="preserve"> a </w:t>
+            </w:r>
+            <w:proofErr w:type="spellStart"/>
+            <w:r>
+              <w:t>kijelentkezés</w:t>
+            </w:r>
+            <w:proofErr w:type="spellEnd"/>
+            <w:r>
+              <w:t xml:space="preserve"> </w:t>
+            </w:r>
+            <w:proofErr w:type="spellStart"/>
+            <w:r>
+              <w:t>gombot</w:t>
+            </w:r>
+            <w:proofErr w:type="spellEnd"/>
+            <w:r>
+              <w:t xml:space="preserve">, </w:t>
+            </w:r>
+            <w:proofErr w:type="spellStart"/>
+            <w:r>
+              <w:t>akkor</w:t>
+            </w:r>
+            <w:proofErr w:type="spellEnd"/>
+            <w:r>
+              <w:t xml:space="preserve"> </w:t>
+            </w:r>
+            <w:proofErr w:type="spellStart"/>
             <w:r>
               <w:lastRenderedPageBreak/>
-              <w:t>kilépteti a felhasználót.</w:t>
+              <w:t>kilépteti</w:t>
+            </w:r>
+            <w:proofErr w:type="spellEnd"/>
+            <w:r>
+              <w:t xml:space="preserve"> a </w:t>
+            </w:r>
+            <w:proofErr w:type="spellStart"/>
+            <w:r>
+              <w:t>felhasználót</w:t>
+            </w:r>
+            <w:proofErr w:type="spellEnd"/>
+            <w:r>
+              <w:t>.</w:t>
             </w:r>
           </w:p>
         </w:tc>
@@ -242,7 +1036,45 @@
           <w:p>
             <w:r>
               <w:lastRenderedPageBreak/>
-              <w:t>500: Szerver hiba.</w:t>
+              <w:t xml:space="preserve">500: </w:t>
+            </w:r>
+            <w:proofErr w:type="spellStart"/>
+            <w:r>
+              <w:t>Szerver</w:t>
+            </w:r>
+            <w:proofErr w:type="spellEnd"/>
+            <w:r>
+              <w:t xml:space="preserve"> </w:t>
+            </w:r>
+            <w:proofErr w:type="spellStart"/>
+            <w:r>
+              <w:t>hiba</w:t>
+            </w:r>
+            <w:proofErr w:type="spellEnd"/>
+            <w:r>
+              <w:t>.</w:t>
+            </w:r>
+          </w:p>
+          <w:p/>
+          <w:p>
+            <w:r>
+              <w:t xml:space="preserve">200: </w:t>
+            </w:r>
+            <w:proofErr w:type="spellStart"/>
+            <w:r>
+              <w:t>Sikeres</w:t>
+            </w:r>
+            <w:proofErr w:type="spellEnd"/>
+            <w:r>
+              <w:t xml:space="preserve"> </w:t>
+            </w:r>
+            <w:proofErr w:type="spellStart"/>
+            <w:r>
+              <w:t>kijelentkezés</w:t>
+            </w:r>
+            <w:proofErr w:type="spellEnd"/>
+            <w:r>
+              <w:t>.</w:t>
             </w:r>
           </w:p>
         </w:tc>
@@ -254,8 +1086,13 @@
           </w:tcPr>
           <w:p>
             <w:r>
-              <w:t>/me</w:t>
-            </w:r>
+              <w:t>/</w:t>
+            </w:r>
+            <w:proofErr w:type="gramStart"/>
+            <w:r>
+              <w:t>me</w:t>
+            </w:r>
+            <w:proofErr w:type="gramEnd"/>
           </w:p>
         </w:tc>
         <w:tc>
@@ -274,13 +1111,183 @@
           </w:tcPr>
           <w:p>
             <w:r>
-              <w:t>Előszőr ellenőrzi, hogy be van-e jelentkezve. Ha nem, kiírja, hogy Nincs bejelentkezve.</w:t>
+              <w:t xml:space="preserve">Előszőr </w:t>
+            </w:r>
+            <w:proofErr w:type="spellStart"/>
+            <w:r>
+              <w:t>ellenőrzi</w:t>
+            </w:r>
+            <w:proofErr w:type="spellEnd"/>
+            <w:r>
+              <w:t xml:space="preserve">, </w:t>
+            </w:r>
+            <w:proofErr w:type="spellStart"/>
+            <w:r>
+              <w:t>hogy</w:t>
+            </w:r>
+            <w:proofErr w:type="spellEnd"/>
+            <w:r>
+              <w:t xml:space="preserve"> be van-e </w:t>
+            </w:r>
+            <w:proofErr w:type="spellStart"/>
+            <w:r>
+              <w:t>jelentkezve</w:t>
+            </w:r>
+            <w:proofErr w:type="spellEnd"/>
+            <w:r>
+              <w:t xml:space="preserve">. Ha </w:t>
+            </w:r>
+            <w:proofErr w:type="spellStart"/>
+            <w:r>
+              <w:t>nem</w:t>
+            </w:r>
+            <w:proofErr w:type="spellEnd"/>
+            <w:r>
+              <w:t xml:space="preserve">, </w:t>
+            </w:r>
+            <w:proofErr w:type="spellStart"/>
+            <w:r>
+              <w:t>kiírja</w:t>
+            </w:r>
+            <w:proofErr w:type="spellEnd"/>
+            <w:r>
+              <w:t xml:space="preserve">, </w:t>
+            </w:r>
+            <w:proofErr w:type="spellStart"/>
+            <w:r>
+              <w:t>hogy</w:t>
+            </w:r>
+            <w:proofErr w:type="spellEnd"/>
+            <w:r>
+              <w:t xml:space="preserve"> </w:t>
+            </w:r>
+            <w:proofErr w:type="spellStart"/>
+            <w:r>
+              <w:t>Nincs</w:t>
+            </w:r>
+            <w:proofErr w:type="spellEnd"/>
+            <w:r>
+              <w:t xml:space="preserve"> </w:t>
+            </w:r>
+            <w:proofErr w:type="spellStart"/>
+            <w:r>
+              <w:t>bejelentkezve</w:t>
+            </w:r>
+            <w:proofErr w:type="spellEnd"/>
+            <w:r>
+              <w:t>.</w:t>
             </w:r>
           </w:p>
           <w:p>
             <w:r>
-              <w:t>Ha be van, akkor megkeresi az ID-ját a felhasználónak, és a szerint megkeresi.</w:t>
-            </w:r>
+              <w:t xml:space="preserve">Ha be van, </w:t>
+            </w:r>
+            <w:proofErr w:type="spellStart"/>
+            <w:r>
+              <w:t>akkor</w:t>
+            </w:r>
+            <w:proofErr w:type="spellEnd"/>
+            <w:r>
+              <w:t xml:space="preserve"> </w:t>
+            </w:r>
+            <w:proofErr w:type="spellStart"/>
+            <w:r>
+              <w:t>az</w:t>
+            </w:r>
+            <w:proofErr w:type="spellEnd"/>
+            <w:r>
+              <w:t xml:space="preserve"> ID-</w:t>
+            </w:r>
+            <w:proofErr w:type="spellStart"/>
+            <w:r>
+              <w:t>já</w:t>
+            </w:r>
+            <w:r>
+              <w:t>val</w:t>
+            </w:r>
+            <w:proofErr w:type="spellEnd"/>
+            <w:r>
+              <w:t xml:space="preserve"> a</w:t>
+            </w:r>
+            <w:r>
+              <w:t xml:space="preserve"> </w:t>
+            </w:r>
+            <w:proofErr w:type="spellStart"/>
+            <w:r>
+              <w:t>megkeresi</w:t>
+            </w:r>
+            <w:proofErr w:type="spellEnd"/>
+            <w:r>
+              <w:t xml:space="preserve"> </w:t>
+            </w:r>
+            <w:proofErr w:type="spellStart"/>
+            <w:r>
+              <w:t>és</w:t>
+            </w:r>
+            <w:proofErr w:type="spellEnd"/>
+            <w:r>
+              <w:t xml:space="preserve"> </w:t>
+            </w:r>
+            <w:proofErr w:type="spellStart"/>
+            <w:r>
+              <w:t>belépteti</w:t>
+            </w:r>
+            <w:proofErr w:type="spellEnd"/>
+            <w:r>
+              <w:t>.</w:t>
+            </w:r>
+          </w:p>
+        </w:tc>
+        <w:tc>
+          <w:tcPr>
+            <w:tcW w:w="2338" w:type="dxa"/>
+          </w:tcPr>
+          <w:p>
+            <w:r>
+              <w:t xml:space="preserve">500: </w:t>
+            </w:r>
+            <w:proofErr w:type="spellStart"/>
+            <w:r>
+              <w:t>Szerver</w:t>
+            </w:r>
+            <w:proofErr w:type="spellEnd"/>
+            <w:r>
+              <w:t xml:space="preserve"> </w:t>
+            </w:r>
+            <w:proofErr w:type="spellStart"/>
+            <w:r>
+              <w:t>hiba</w:t>
+            </w:r>
+            <w:proofErr w:type="spellEnd"/>
+            <w:r>
+              <w:t>.</w:t>
+            </w:r>
+          </w:p>
+        </w:tc>
+      </w:tr>
+      <w:tr>
+        <w:tc>
+          <w:tcPr>
+            <w:tcW w:w="2337" w:type="dxa"/>
+          </w:tcPr>
+          <w:p/>
+        </w:tc>
+        <w:tc>
+          <w:tcPr>
+            <w:tcW w:w="2337" w:type="dxa"/>
+          </w:tcPr>
+          <w:p/>
+        </w:tc>
+        <w:tc>
+          <w:tcPr>
+            <w:tcW w:w="2338" w:type="dxa"/>
+          </w:tcPr>
+          <w:p>
+            <w:proofErr w:type="spellStart"/>
+            <w:r>
+              <w:t>Főoldal</w:t>
+            </w:r>
+            <w:proofErr w:type="spellEnd"/>
           </w:p>
         </w:tc>
         <w:tc>
@@ -309,7 +1316,7 @@
           </w:tcPr>
           <w:p>
             <w:r>
-              <w:t>Főoldal</w:t>
+              <w:t>Kosár</w:t>
             </w:r>
           </w:p>
         </w:tc>
@@ -338,39 +1345,11 @@
             <w:tcW w:w="2338" w:type="dxa"/>
           </w:tcPr>
           <w:p>
-            <w:r>
-              <w:t>Kosár</w:t>
-            </w:r>
-          </w:p>
-        </w:tc>
-        <w:tc>
-          <w:tcPr>
-            <w:tcW w:w="2338" w:type="dxa"/>
-          </w:tcPr>
-          <w:p/>
-        </w:tc>
-      </w:tr>
-      <w:tr>
-        <w:tc>
-          <w:tcPr>
-            <w:tcW w:w="2337" w:type="dxa"/>
-          </w:tcPr>
-          <w:p/>
-        </w:tc>
-        <w:tc>
-          <w:tcPr>
-            <w:tcW w:w="2337" w:type="dxa"/>
-          </w:tcPr>
-          <w:p/>
-        </w:tc>
-        <w:tc>
-          <w:tcPr>
-            <w:tcW w:w="2338" w:type="dxa"/>
-          </w:tcPr>
-          <w:p>
+            <w:proofErr w:type="spellStart"/>
             <w:r>
               <w:t>Foglalás</w:t>
             </w:r>
+            <w:proofErr w:type="spellEnd"/>
           </w:p>
         </w:tc>
         <w:tc>
@@ -382,6 +1361,1434 @@
       </w:tr>
     </w:tbl>
     <w:p/>
+    <w:p/>
+    <w:p>
+      <w:proofErr w:type="spellStart"/>
+      <w:r>
+        <w:t>Ezek</w:t>
+      </w:r>
+      <w:proofErr w:type="spellEnd"/>
+      <w:r>
+        <w:t xml:space="preserve"> </w:t>
+      </w:r>
+      <w:proofErr w:type="spellStart"/>
+      <w:r>
+        <w:t>itt</w:t>
+      </w:r>
+      <w:proofErr w:type="spellEnd"/>
+      <w:r>
+        <w:t xml:space="preserve"> </w:t>
+      </w:r>
+      <w:proofErr w:type="spellStart"/>
+      <w:r>
+        <w:t>azok</w:t>
+      </w:r>
+      <w:proofErr w:type="spellEnd"/>
+      <w:r>
+        <w:t xml:space="preserve"> a </w:t>
+      </w:r>
+      <w:proofErr w:type="spellStart"/>
+      <w:r>
+        <w:t>végpontok</w:t>
+      </w:r>
+      <w:proofErr w:type="spellEnd"/>
+      <w:r>
+        <w:t xml:space="preserve">, </w:t>
+      </w:r>
+      <w:proofErr w:type="spellStart"/>
+      <w:r>
+        <w:t>melyeket</w:t>
+      </w:r>
+      <w:proofErr w:type="spellEnd"/>
+      <w:r>
+        <w:t xml:space="preserve"> </w:t>
+      </w:r>
+      <w:proofErr w:type="spellStart"/>
+      <w:r>
+        <w:t>külön</w:t>
+      </w:r>
+      <w:proofErr w:type="spellEnd"/>
+      <w:r>
+        <w:t xml:space="preserve"> </w:t>
+      </w:r>
+      <w:proofErr w:type="spellStart"/>
+      <w:r>
+        <w:t>írtam</w:t>
+      </w:r>
+      <w:proofErr w:type="spellEnd"/>
+      <w:r>
+        <w:t xml:space="preserve"> ki: </w:t>
+      </w:r>
+    </w:p>
+    <w:p>
+      <w:pPr>
+        <w:rPr>
+          <w:b/>
+          <w:bCs/>
+        </w:rPr>
+      </w:pPr>
+      <w:proofErr w:type="spellStart"/>
+      <w:r>
+        <w:rPr>
+          <w:b/>
+          <w:bCs/>
+        </w:rPr>
+        <w:t>Foglalas</w:t>
+      </w:r>
+      <w:proofErr w:type="spellEnd"/>
+      <w:r>
+        <w:rPr>
+          <w:b/>
+          <w:bCs/>
+        </w:rPr>
+        <w:t xml:space="preserve"> Routes (</w:t>
+      </w:r>
+      <w:r>
+        <w:t>foglalasRoute.js</w:t>
+      </w:r>
+      <w:r>
+        <w:rPr>
+          <w:b/>
+          <w:bCs/>
+        </w:rPr>
+        <w:t>)</w:t>
+      </w:r>
+    </w:p>
+    <w:p>
+      <w:pPr>
+        <w:numPr>
+          <w:ilvl w:val="0"/>
+          <w:numId w:val="7"/>
+        </w:numPr>
+      </w:pPr>
+      <w:r>
+        <w:rPr>
+          <w:b/>
+          <w:bCs/>
+        </w:rPr>
+        <w:t>POST</w:t>
+      </w:r>
+      <w:r>
+        <w:t xml:space="preserve"> /</w:t>
+      </w:r>
+      <w:proofErr w:type="spellStart"/>
+      <w:r>
+        <w:t>api</w:t>
+      </w:r>
+      <w:proofErr w:type="spellEnd"/>
+      <w:r>
+        <w:t>/auth/</w:t>
+      </w:r>
+      <w:proofErr w:type="spellStart"/>
+      <w:r>
+        <w:t>foglalasCreate</w:t>
+      </w:r>
+      <w:proofErr w:type="spellEnd"/>
+      <w:r>
+        <w:t xml:space="preserve"> - Create a new </w:t>
+      </w:r>
+      <w:proofErr w:type="spellStart"/>
+      <w:r>
+        <w:t>foglalas</w:t>
+      </w:r>
+      <w:proofErr w:type="spellEnd"/>
+      <w:r>
+        <w:t xml:space="preserve"> (booking)</w:t>
+      </w:r>
+    </w:p>
+    <w:p>
+      <w:pPr>
+        <w:numPr>
+          <w:ilvl w:val="1"/>
+          <w:numId w:val="7"/>
+        </w:numPr>
+      </w:pPr>
+      <w:r>
+        <w:rPr>
+          <w:b/>
+          <w:bCs/>
+        </w:rPr>
+        <w:t>200</w:t>
+      </w:r>
+      <w:r>
+        <w:t> (OK) - Successful creation and email sent</w:t>
+      </w:r>
+    </w:p>
+    <w:p>
+      <w:pPr>
+        <w:numPr>
+          <w:ilvl w:val="1"/>
+          <w:numId w:val="7"/>
+        </w:numPr>
+      </w:pPr>
+      <w:r>
+        <w:rPr>
+          <w:b/>
+          <w:bCs/>
+        </w:rPr>
+        <w:t>400</w:t>
+      </w:r>
+      <w:r>
+        <w:t> (Bad Request) - Missing required fields</w:t>
+      </w:r>
+    </w:p>
+    <w:p>
+      <w:pPr>
+        <w:numPr>
+          <w:ilvl w:val="1"/>
+          <w:numId w:val="7"/>
+        </w:numPr>
+      </w:pPr>
+      <w:r>
+        <w:rPr>
+          <w:b/>
+          <w:bCs/>
+        </w:rPr>
+        <w:t>500</w:t>
+      </w:r>
+      <w:r>
+        <w:t> (Internal Server Error) - Server error during creation or email sending</w:t>
+      </w:r>
+    </w:p>
+    <w:p>
+      <w:pPr>
+        <w:numPr>
+          <w:ilvl w:val="0"/>
+          <w:numId w:val="7"/>
+        </w:numPr>
+      </w:pPr>
+      <w:r>
+        <w:rPr>
+          <w:b/>
+          <w:bCs/>
+        </w:rPr>
+        <w:t>PUT</w:t>
+      </w:r>
+      <w:r>
+        <w:t xml:space="preserve"> /</w:t>
+      </w:r>
+      <w:proofErr w:type="spellStart"/>
+      <w:r>
+        <w:t>api</w:t>
+      </w:r>
+      <w:proofErr w:type="spellEnd"/>
+      <w:r>
+        <w:t>/auth/</w:t>
+      </w:r>
+      <w:proofErr w:type="spellStart"/>
+      <w:r>
+        <w:t>foglalasModify</w:t>
+      </w:r>
+      <w:proofErr w:type="spellEnd"/>
+      <w:r>
+        <w:t xml:space="preserve">/:id - Modify an existing </w:t>
+      </w:r>
+      <w:proofErr w:type="spellStart"/>
+      <w:r>
+        <w:t>foglalas</w:t>
+      </w:r>
+      <w:proofErr w:type="spellEnd"/>
+      <w:r>
+        <w:t xml:space="preserve"> by ID</w:t>
+      </w:r>
+    </w:p>
+    <w:p>
+      <w:pPr>
+        <w:numPr>
+          <w:ilvl w:val="1"/>
+          <w:numId w:val="7"/>
+        </w:numPr>
+      </w:pPr>
+      <w:r>
+        <w:rPr>
+          <w:b/>
+          <w:bCs/>
+        </w:rPr>
+        <w:t>200</w:t>
+      </w:r>
+      <w:r>
+        <w:t> (OK) - Successful modification</w:t>
+      </w:r>
+    </w:p>
+    <w:p>
+      <w:pPr>
+        <w:numPr>
+          <w:ilvl w:val="1"/>
+          <w:numId w:val="7"/>
+        </w:numPr>
+      </w:pPr>
+      <w:r>
+        <w:rPr>
+          <w:b/>
+          <w:bCs/>
+        </w:rPr>
+        <w:t>400</w:t>
+      </w:r>
+      <w:r>
+        <w:t> (Bad Request) - Missing ID or no updates provided</w:t>
+      </w:r>
+    </w:p>
+    <w:p>
+      <w:pPr>
+        <w:numPr>
+          <w:ilvl w:val="1"/>
+          <w:numId w:val="7"/>
+        </w:numPr>
+      </w:pPr>
+      <w:r>
+        <w:rPr>
+          <w:b/>
+          <w:bCs/>
+        </w:rPr>
+        <w:t>500</w:t>
+      </w:r>
+      <w:r>
+        <w:t> (Internal Server Error) - Server error during modification</w:t>
+      </w:r>
+    </w:p>
+    <w:p>
+      <w:pPr>
+        <w:numPr>
+          <w:ilvl w:val="0"/>
+          <w:numId w:val="7"/>
+        </w:numPr>
+      </w:pPr>
+      <w:r>
+        <w:rPr>
+          <w:b/>
+          <w:bCs/>
+        </w:rPr>
+        <w:t>DELETE</w:t>
+      </w:r>
+      <w:r>
+        <w:t xml:space="preserve"> /</w:t>
+      </w:r>
+      <w:proofErr w:type="spellStart"/>
+      <w:r>
+        <w:t>api</w:t>
+      </w:r>
+      <w:proofErr w:type="spellEnd"/>
+      <w:r>
+        <w:t>/auth/</w:t>
+      </w:r>
+      <w:proofErr w:type="spellStart"/>
+      <w:proofErr w:type="gramStart"/>
+      <w:r>
+        <w:t>foglalasDelete</w:t>
+      </w:r>
+      <w:proofErr w:type="spellEnd"/>
+      <w:r>
+        <w:t>/:</w:t>
+      </w:r>
+      <w:proofErr w:type="gramEnd"/>
+      <w:r>
+        <w:t xml:space="preserve">id - Delete a </w:t>
+      </w:r>
+      <w:proofErr w:type="spellStart"/>
+      <w:r>
+        <w:t>foglalas</w:t>
+      </w:r>
+      <w:proofErr w:type="spellEnd"/>
+      <w:r>
+        <w:t xml:space="preserve"> by ID</w:t>
+      </w:r>
+    </w:p>
+    <w:p>
+      <w:pPr>
+        <w:numPr>
+          <w:ilvl w:val="1"/>
+          <w:numId w:val="7"/>
+        </w:numPr>
+      </w:pPr>
+      <w:r>
+        <w:rPr>
+          <w:b/>
+          <w:bCs/>
+        </w:rPr>
+        <w:t>200</w:t>
+      </w:r>
+      <w:r>
+        <w:t> (OK) - Successful deletion</w:t>
+      </w:r>
+    </w:p>
+    <w:p>
+      <w:pPr>
+        <w:numPr>
+          <w:ilvl w:val="1"/>
+          <w:numId w:val="7"/>
+        </w:numPr>
+      </w:pPr>
+      <w:r>
+        <w:rPr>
+          <w:b/>
+          <w:bCs/>
+        </w:rPr>
+        <w:t>400</w:t>
+      </w:r>
+      <w:r>
+        <w:t> (Bad Request) - Missing ID</w:t>
+      </w:r>
+    </w:p>
+    <w:p>
+      <w:pPr>
+        <w:numPr>
+          <w:ilvl w:val="1"/>
+          <w:numId w:val="7"/>
+        </w:numPr>
+      </w:pPr>
+      <w:r>
+        <w:rPr>
+          <w:b/>
+          <w:bCs/>
+        </w:rPr>
+        <w:t>500</w:t>
+      </w:r>
+      <w:r>
+        <w:t> (Internal Server Error) - Server error during deletion</w:t>
+      </w:r>
+    </w:p>
+    <w:p>
+      <w:pPr>
+        <w:rPr>
+          <w:b/>
+          <w:bCs/>
+        </w:rPr>
+      </w:pPr>
+      <w:r>
+        <w:rPr>
+          <w:b/>
+          <w:bCs/>
+        </w:rPr>
+        <w:t>Admin Routes (</w:t>
+      </w:r>
+      <w:r>
+        <w:t>adminRoute.js</w:t>
+      </w:r>
+      <w:r>
+        <w:rPr>
+          <w:b/>
+          <w:bCs/>
+        </w:rPr>
+        <w:t>)</w:t>
+      </w:r>
+    </w:p>
+    <w:p>
+      <w:pPr>
+        <w:numPr>
+          <w:ilvl w:val="0"/>
+          <w:numId w:val="8"/>
+        </w:numPr>
+      </w:pPr>
+      <w:r>
+        <w:rPr>
+          <w:b/>
+          <w:bCs/>
+        </w:rPr>
+        <w:t>DELETE</w:t>
+      </w:r>
+      <w:r>
+        <w:t xml:space="preserve"> /</w:t>
+      </w:r>
+      <w:proofErr w:type="spellStart"/>
+      <w:r>
+        <w:t>api</w:t>
+      </w:r>
+      <w:proofErr w:type="spellEnd"/>
+      <w:r>
+        <w:t>/auth/</w:t>
+      </w:r>
+      <w:proofErr w:type="spellStart"/>
+      <w:r>
+        <w:t>userControll</w:t>
+      </w:r>
+      <w:proofErr w:type="spellEnd"/>
+      <w:r>
+        <w:t>/delete - Delete user (placeholder implementation)</w:t>
+      </w:r>
+    </w:p>
+    <w:p>
+      <w:pPr>
+        <w:numPr>
+          <w:ilvl w:val="1"/>
+          <w:numId w:val="8"/>
+        </w:numPr>
+      </w:pPr>
+      <w:r>
+        <w:lastRenderedPageBreak/>
+        <w:t>No status codes defined in the code</w:t>
+      </w:r>
+    </w:p>
+    <w:p>
+      <w:pPr>
+        <w:numPr>
+          <w:ilvl w:val="0"/>
+          <w:numId w:val="8"/>
+        </w:numPr>
+      </w:pPr>
+      <w:r>
+        <w:rPr>
+          <w:b/>
+          <w:bCs/>
+        </w:rPr>
+        <w:t>PUT</w:t>
+      </w:r>
+      <w:r>
+        <w:t xml:space="preserve"> /</w:t>
+      </w:r>
+      <w:proofErr w:type="spellStart"/>
+      <w:r>
+        <w:t>api</w:t>
+      </w:r>
+      <w:proofErr w:type="spellEnd"/>
+      <w:r>
+        <w:t>/auth/</w:t>
+      </w:r>
+      <w:proofErr w:type="spellStart"/>
+      <w:r>
+        <w:t>usersController</w:t>
+      </w:r>
+      <w:proofErr w:type="spellEnd"/>
+      <w:r>
+        <w:t>/modify - Modify user (placeholder implementation)</w:t>
+      </w:r>
+    </w:p>
+    <w:p>
+      <w:pPr>
+        <w:numPr>
+          <w:ilvl w:val="1"/>
+          <w:numId w:val="8"/>
+        </w:numPr>
+      </w:pPr>
+      <w:r>
+        <w:t>No status codes defined in the code</w:t>
+      </w:r>
+    </w:p>
+    <w:p>
+      <w:pPr>
+        <w:numPr>
+          <w:ilvl w:val="0"/>
+          <w:numId w:val="8"/>
+        </w:numPr>
+      </w:pPr>
+      <w:r>
+        <w:rPr>
+          <w:b/>
+          <w:bCs/>
+        </w:rPr>
+        <w:t>POST</w:t>
+      </w:r>
+      <w:r>
+        <w:t xml:space="preserve"> /</w:t>
+      </w:r>
+      <w:proofErr w:type="spellStart"/>
+      <w:r>
+        <w:t>api</w:t>
+      </w:r>
+      <w:proofErr w:type="spellEnd"/>
+      <w:r>
+        <w:t>/auth/</w:t>
+      </w:r>
+      <w:proofErr w:type="spellStart"/>
+      <w:r>
+        <w:t>usersController</w:t>
+      </w:r>
+      <w:proofErr w:type="spellEnd"/>
+      <w:r>
+        <w:t>/create - Create user (placeholder implementation)</w:t>
+      </w:r>
+    </w:p>
+    <w:p>
+      <w:pPr>
+        <w:numPr>
+          <w:ilvl w:val="1"/>
+          <w:numId w:val="8"/>
+        </w:numPr>
+      </w:pPr>
+      <w:r>
+        <w:t>No status codes defined in the code</w:t>
+      </w:r>
+    </w:p>
+    <w:p>
+      <w:pPr>
+        <w:numPr>
+          <w:ilvl w:val="0"/>
+          <w:numId w:val="8"/>
+        </w:numPr>
+      </w:pPr>
+      <w:r>
+        <w:rPr>
+          <w:b/>
+          <w:bCs/>
+        </w:rPr>
+        <w:t>GET</w:t>
+      </w:r>
+      <w:r>
+        <w:t xml:space="preserve"> /</w:t>
+      </w:r>
+      <w:proofErr w:type="spellStart"/>
+      <w:r>
+        <w:t>api</w:t>
+      </w:r>
+      <w:proofErr w:type="spellEnd"/>
+      <w:r>
+        <w:t>/auth/</w:t>
+      </w:r>
+      <w:proofErr w:type="spellStart"/>
+      <w:r>
+        <w:t>usersController</w:t>
+      </w:r>
+      <w:proofErr w:type="spellEnd"/>
+      <w:r>
+        <w:t>/</w:t>
+      </w:r>
+      <w:proofErr w:type="spellStart"/>
+      <w:r>
+        <w:t>getUser:id</w:t>
+      </w:r>
+      <w:proofErr w:type="spellEnd"/>
+      <w:r>
+        <w:t xml:space="preserve"> - Get user by ID (placeholder implementation)</w:t>
+      </w:r>
+    </w:p>
+    <w:p>
+      <w:pPr>
+        <w:numPr>
+          <w:ilvl w:val="1"/>
+          <w:numId w:val="8"/>
+        </w:numPr>
+      </w:pPr>
+      <w:r>
+        <w:t>No status codes defined in the code</w:t>
+      </w:r>
+    </w:p>
+    <w:p>
+      <w:pPr>
+        <w:numPr>
+          <w:ilvl w:val="0"/>
+          <w:numId w:val="8"/>
+        </w:numPr>
+      </w:pPr>
+      <w:r>
+        <w:rPr>
+          <w:b/>
+          <w:bCs/>
+        </w:rPr>
+        <w:t>GET</w:t>
+      </w:r>
+      <w:r>
+        <w:t xml:space="preserve"> /</w:t>
+      </w:r>
+      <w:proofErr w:type="spellStart"/>
+      <w:r>
+        <w:t>api</w:t>
+      </w:r>
+      <w:proofErr w:type="spellEnd"/>
+      <w:r>
+        <w:t>/auth/</w:t>
+      </w:r>
+      <w:proofErr w:type="spellStart"/>
+      <w:r>
+        <w:t>usersController</w:t>
+      </w:r>
+      <w:proofErr w:type="spellEnd"/>
+      <w:r>
+        <w:t>/</w:t>
+      </w:r>
+      <w:proofErr w:type="spellStart"/>
+      <w:r>
+        <w:t>getUser</w:t>
+      </w:r>
+      <w:proofErr w:type="spellEnd"/>
+      <w:r>
+        <w:t xml:space="preserve"> - Get users (placeholder implementation)</w:t>
+      </w:r>
+    </w:p>
+    <w:p>
+      <w:pPr>
+        <w:numPr>
+          <w:ilvl w:val="1"/>
+          <w:numId w:val="8"/>
+        </w:numPr>
+      </w:pPr>
+      <w:r>
+        <w:t>No status codes defined in the code</w:t>
+      </w:r>
+    </w:p>
+    <w:p>
+      <w:pPr>
+        <w:rPr>
+          <w:b/>
+          <w:bCs/>
+        </w:rPr>
+      </w:pPr>
+      <w:proofErr w:type="spellStart"/>
+      <w:r>
+        <w:rPr>
+          <w:b/>
+          <w:bCs/>
+        </w:rPr>
+        <w:t>Rendelesek</w:t>
+      </w:r>
+      <w:proofErr w:type="spellEnd"/>
+      <w:r>
+        <w:rPr>
+          <w:b/>
+          <w:bCs/>
+        </w:rPr>
+        <w:t xml:space="preserve"> Routes (</w:t>
+      </w:r>
+      <w:r>
+        <w:t>rendelesekRoute.js</w:t>
+      </w:r>
+      <w:r>
+        <w:rPr>
+          <w:b/>
+          <w:bCs/>
+        </w:rPr>
+        <w:t>)</w:t>
+      </w:r>
+    </w:p>
+    <w:p>
+      <w:pPr>
+        <w:numPr>
+          <w:ilvl w:val="0"/>
+          <w:numId w:val="9"/>
+        </w:numPr>
+      </w:pPr>
+      <w:r>
+        <w:rPr>
+          <w:b/>
+          <w:bCs/>
+        </w:rPr>
+        <w:t>POST</w:t>
+      </w:r>
+      <w:r>
+        <w:t xml:space="preserve"> /</w:t>
+      </w:r>
+      <w:proofErr w:type="spellStart"/>
+      <w:r>
+        <w:t>api</w:t>
+      </w:r>
+      <w:proofErr w:type="spellEnd"/>
+      <w:r>
+        <w:t>/auth/</w:t>
+      </w:r>
+      <w:proofErr w:type="spellStart"/>
+      <w:r>
+        <w:t>rendelesCreate</w:t>
+      </w:r>
+      <w:proofErr w:type="spellEnd"/>
+      <w:r>
+        <w:t xml:space="preserve"> - Create a new </w:t>
+      </w:r>
+      <w:proofErr w:type="spellStart"/>
+      <w:r>
+        <w:t>rendelés</w:t>
+      </w:r>
+      <w:proofErr w:type="spellEnd"/>
+      <w:r>
+        <w:t xml:space="preserve"> (order)</w:t>
+      </w:r>
+    </w:p>
+    <w:p>
+      <w:pPr>
+        <w:numPr>
+          <w:ilvl w:val="1"/>
+          <w:numId w:val="9"/>
+        </w:numPr>
+      </w:pPr>
+      <w:r>
+        <w:rPr>
+          <w:b/>
+          <w:bCs/>
+        </w:rPr>
+        <w:t>201</w:t>
+      </w:r>
+      <w:r>
+        <w:t> (Created) - Successful creation</w:t>
+      </w:r>
+    </w:p>
+    <w:p>
+      <w:pPr>
+        <w:numPr>
+          <w:ilvl w:val="1"/>
+          <w:numId w:val="9"/>
+        </w:numPr>
+      </w:pPr>
+      <w:r>
+        <w:rPr>
+          <w:b/>
+          <w:bCs/>
+        </w:rPr>
+        <w:t>400</w:t>
+      </w:r>
+      <w:r>
+        <w:t> (Bad Request) - Empty cart or missing fields</w:t>
+      </w:r>
+    </w:p>
+    <w:p>
+      <w:pPr>
+        <w:numPr>
+          <w:ilvl w:val="1"/>
+          <w:numId w:val="9"/>
+        </w:numPr>
+      </w:pPr>
+      <w:r>
+        <w:rPr>
+          <w:b/>
+          <w:bCs/>
+        </w:rPr>
+        <w:t>401</w:t>
+      </w:r>
+      <w:r>
+        <w:t> (Unauthorized) - Invalid token for authenticated users</w:t>
+      </w:r>
+    </w:p>
+    <w:p>
+      <w:pPr>
+        <w:numPr>
+          <w:ilvl w:val="1"/>
+          <w:numId w:val="9"/>
+        </w:numPr>
+      </w:pPr>
+      <w:r>
+        <w:rPr>
+          <w:b/>
+          <w:bCs/>
+        </w:rPr>
+        <w:t>500</w:t>
+      </w:r>
+      <w:r>
+        <w:t> (Internal Server Error) - Server error during creation</w:t>
+      </w:r>
+    </w:p>
+    <w:p>
+      <w:pPr>
+        <w:numPr>
+          <w:ilvl w:val="0"/>
+          <w:numId w:val="9"/>
+        </w:numPr>
+      </w:pPr>
+      <w:r>
+        <w:rPr>
+          <w:b/>
+          <w:bCs/>
+        </w:rPr>
+        <w:t>PUT</w:t>
+      </w:r>
+      <w:r>
+        <w:t xml:space="preserve"> /</w:t>
+      </w:r>
+      <w:proofErr w:type="spellStart"/>
+      <w:r>
+        <w:t>api</w:t>
+      </w:r>
+      <w:proofErr w:type="spellEnd"/>
+      <w:r>
+        <w:t>/auth/</w:t>
+      </w:r>
+      <w:proofErr w:type="spellStart"/>
+      <w:r>
+        <w:t>rendelesModify</w:t>
+      </w:r>
+      <w:proofErr w:type="spellEnd"/>
+      <w:r>
+        <w:t xml:space="preserve">/:id - Modify an existing </w:t>
+      </w:r>
+      <w:proofErr w:type="spellStart"/>
+      <w:r>
+        <w:t>rendelés</w:t>
+      </w:r>
+      <w:proofErr w:type="spellEnd"/>
+      <w:r>
+        <w:t xml:space="preserve"> by ID</w:t>
+      </w:r>
+    </w:p>
+    <w:p>
+      <w:pPr>
+        <w:numPr>
+          <w:ilvl w:val="1"/>
+          <w:numId w:val="9"/>
+        </w:numPr>
+      </w:pPr>
+      <w:r>
+        <w:rPr>
+          <w:b/>
+          <w:bCs/>
+        </w:rPr>
+        <w:t>200</w:t>
+      </w:r>
+      <w:r>
+        <w:t> (OK) - Successful modification</w:t>
+      </w:r>
+    </w:p>
+    <w:p>
+      <w:pPr>
+        <w:numPr>
+          <w:ilvl w:val="1"/>
+          <w:numId w:val="9"/>
+        </w:numPr>
+      </w:pPr>
+      <w:r>
+        <w:rPr>
+          <w:b/>
+          <w:bCs/>
+        </w:rPr>
+        <w:t>400</w:t>
+      </w:r>
+      <w:r>
+        <w:t> (Bad Request) - No updates provided</w:t>
+      </w:r>
+    </w:p>
+    <w:p>
+      <w:pPr>
+        <w:numPr>
+          <w:ilvl w:val="1"/>
+          <w:numId w:val="9"/>
+        </w:numPr>
+      </w:pPr>
+      <w:r>
+        <w:rPr>
+          <w:b/>
+          <w:bCs/>
+        </w:rPr>
+        <w:t>500</w:t>
+      </w:r>
+      <w:r>
+        <w:t> (Internal Server Error) - Server error during modification</w:t>
+      </w:r>
+    </w:p>
+    <w:p>
+      <w:pPr>
+        <w:numPr>
+          <w:ilvl w:val="0"/>
+          <w:numId w:val="9"/>
+        </w:numPr>
+      </w:pPr>
+      <w:r>
+        <w:rPr>
+          <w:b/>
+          <w:bCs/>
+        </w:rPr>
+        <w:t>DELETE</w:t>
+      </w:r>
+      <w:r>
+        <w:t xml:space="preserve"> /</w:t>
+      </w:r>
+      <w:proofErr w:type="spellStart"/>
+      <w:r>
+        <w:t>api</w:t>
+      </w:r>
+      <w:proofErr w:type="spellEnd"/>
+      <w:r>
+        <w:t>/auth/</w:t>
+      </w:r>
+      <w:proofErr w:type="spellStart"/>
+      <w:r>
+        <w:t>rendelesDelete</w:t>
+      </w:r>
+      <w:proofErr w:type="spellEnd"/>
+      <w:r>
+        <w:t xml:space="preserve">/:id - Delete a </w:t>
+      </w:r>
+      <w:proofErr w:type="spellStart"/>
+      <w:r>
+        <w:t>rendelés</w:t>
+      </w:r>
+      <w:proofErr w:type="spellEnd"/>
+      <w:r>
+        <w:t xml:space="preserve"> by ID</w:t>
+      </w:r>
+    </w:p>
+    <w:p>
+      <w:pPr>
+        <w:numPr>
+          <w:ilvl w:val="1"/>
+          <w:numId w:val="9"/>
+        </w:numPr>
+      </w:pPr>
+      <w:r>
+        <w:rPr>
+          <w:b/>
+          <w:bCs/>
+        </w:rPr>
+        <w:t>200</w:t>
+      </w:r>
+      <w:r>
+        <w:t> (OK) - Successful deletion</w:t>
+      </w:r>
+    </w:p>
+    <w:p>
+      <w:pPr>
+        <w:numPr>
+          <w:ilvl w:val="1"/>
+          <w:numId w:val="9"/>
+        </w:numPr>
+      </w:pPr>
+      <w:r>
+        <w:rPr>
+          <w:b/>
+          <w:bCs/>
+        </w:rPr>
+        <w:t>400</w:t>
+      </w:r>
+      <w:r>
+        <w:t> (Bad Request) - Missing ID</w:t>
+      </w:r>
+    </w:p>
+    <w:p>
+      <w:pPr>
+        <w:numPr>
+          <w:ilvl w:val="1"/>
+          <w:numId w:val="9"/>
+        </w:numPr>
+      </w:pPr>
+      <w:r>
+        <w:rPr>
+          <w:b/>
+          <w:bCs/>
+        </w:rPr>
+        <w:t>500</w:t>
+      </w:r>
+      <w:r>
+        <w:t> (Internal Server Error) - Server error during deletion</w:t>
+      </w:r>
+    </w:p>
+    <w:p>
+      <w:pPr>
+        <w:rPr>
+          <w:b/>
+          <w:bCs/>
+        </w:rPr>
+      </w:pPr>
+      <w:proofErr w:type="spellStart"/>
+      <w:r>
+        <w:rPr>
+          <w:b/>
+          <w:bCs/>
+        </w:rPr>
+        <w:t>Termek</w:t>
+      </w:r>
+      <w:proofErr w:type="spellEnd"/>
+      <w:r>
+        <w:rPr>
+          <w:b/>
+          <w:bCs/>
+        </w:rPr>
+        <w:t xml:space="preserve"> Routes (</w:t>
+      </w:r>
+      <w:r>
+        <w:t>termekRoute.js</w:t>
+      </w:r>
+      <w:r>
+        <w:rPr>
+          <w:b/>
+          <w:bCs/>
+        </w:rPr>
+        <w:t>)</w:t>
+      </w:r>
+    </w:p>
+    <w:p>
+      <w:pPr>
+        <w:numPr>
+          <w:ilvl w:val="0"/>
+          <w:numId w:val="10"/>
+        </w:numPr>
+      </w:pPr>
+      <w:r>
+        <w:rPr>
+          <w:b/>
+          <w:bCs/>
+        </w:rPr>
+        <w:t>GET</w:t>
+      </w:r>
+      <w:r>
+        <w:t xml:space="preserve"> /</w:t>
+      </w:r>
+      <w:proofErr w:type="spellStart"/>
+      <w:r>
+        <w:t>api</w:t>
+      </w:r>
+      <w:proofErr w:type="spellEnd"/>
+      <w:r>
+        <w:t>/auth/</w:t>
+      </w:r>
+      <w:proofErr w:type="spellStart"/>
+      <w:r>
+        <w:t>termekek</w:t>
+      </w:r>
+      <w:proofErr w:type="spellEnd"/>
+      <w:r>
+        <w:t xml:space="preserve"> - Get all </w:t>
+      </w:r>
+      <w:proofErr w:type="spellStart"/>
+      <w:r>
+        <w:t>termékek</w:t>
+      </w:r>
+      <w:proofErr w:type="spellEnd"/>
+      <w:r>
+        <w:t xml:space="preserve"> (products)</w:t>
+      </w:r>
+    </w:p>
+    <w:p>
+      <w:pPr>
+        <w:numPr>
+          <w:ilvl w:val="1"/>
+          <w:numId w:val="10"/>
+        </w:numPr>
+      </w:pPr>
+      <w:r>
+        <w:rPr>
+          <w:b/>
+          <w:bCs/>
+        </w:rPr>
+        <w:lastRenderedPageBreak/>
+        <w:t>200</w:t>
+      </w:r>
+      <w:r>
+        <w:t> (OK) - Successful retrieval</w:t>
+      </w:r>
+    </w:p>
+    <w:p>
+      <w:pPr>
+        <w:numPr>
+          <w:ilvl w:val="1"/>
+          <w:numId w:val="10"/>
+        </w:numPr>
+      </w:pPr>
+      <w:r>
+        <w:rPr>
+          <w:b/>
+          <w:bCs/>
+        </w:rPr>
+        <w:t>500</w:t>
+      </w:r>
+      <w:r>
+        <w:t> (Internal Server Error) - Server error during retrieval</w:t>
+      </w:r>
+    </w:p>
+    <w:p>
+      <w:pPr>
+        <w:numPr>
+          <w:ilvl w:val="0"/>
+          <w:numId w:val="10"/>
+        </w:numPr>
+      </w:pPr>
+      <w:r>
+        <w:rPr>
+          <w:b/>
+          <w:bCs/>
+        </w:rPr>
+        <w:t>POST</w:t>
+      </w:r>
+      <w:r>
+        <w:t xml:space="preserve"> /</w:t>
+      </w:r>
+      <w:proofErr w:type="spellStart"/>
+      <w:r>
+        <w:t>api</w:t>
+      </w:r>
+      <w:proofErr w:type="spellEnd"/>
+      <w:r>
+        <w:t>/auth/</w:t>
+      </w:r>
+      <w:proofErr w:type="spellStart"/>
+      <w:r>
+        <w:t>termekCreate</w:t>
+      </w:r>
+      <w:proofErr w:type="spellEnd"/>
+      <w:r>
+        <w:t xml:space="preserve"> - Create a new </w:t>
+      </w:r>
+      <w:proofErr w:type="spellStart"/>
+      <w:r>
+        <w:t>termék</w:t>
+      </w:r>
+      <w:proofErr w:type="spellEnd"/>
+    </w:p>
+    <w:p>
+      <w:pPr>
+        <w:numPr>
+          <w:ilvl w:val="1"/>
+          <w:numId w:val="10"/>
+        </w:numPr>
+      </w:pPr>
+      <w:r>
+        <w:rPr>
+          <w:b/>
+          <w:bCs/>
+        </w:rPr>
+        <w:t>201</w:t>
+      </w:r>
+      <w:r>
+        <w:t> (Created) - Successful creation</w:t>
+      </w:r>
+    </w:p>
+    <w:p>
+      <w:pPr>
+        <w:numPr>
+          <w:ilvl w:val="1"/>
+          <w:numId w:val="10"/>
+        </w:numPr>
+      </w:pPr>
+      <w:r>
+        <w:rPr>
+          <w:b/>
+          <w:bCs/>
+        </w:rPr>
+        <w:t>400</w:t>
+      </w:r>
+      <w:r>
+        <w:t> (Bad Request) - Missing required fields</w:t>
+      </w:r>
+    </w:p>
+    <w:p>
+      <w:pPr>
+        <w:numPr>
+          <w:ilvl w:val="1"/>
+          <w:numId w:val="10"/>
+        </w:numPr>
+      </w:pPr>
+      <w:r>
+        <w:rPr>
+          <w:b/>
+          <w:bCs/>
+        </w:rPr>
+        <w:t>500</w:t>
+      </w:r>
+      <w:r>
+        <w:t> (Internal Server Error) - Server error during creation</w:t>
+      </w:r>
+    </w:p>
+    <w:p>
+      <w:pPr>
+        <w:numPr>
+          <w:ilvl w:val="0"/>
+          <w:numId w:val="10"/>
+        </w:numPr>
+      </w:pPr>
+      <w:r>
+        <w:rPr>
+          <w:b/>
+          <w:bCs/>
+        </w:rPr>
+        <w:t>PUT</w:t>
+      </w:r>
+      <w:r>
+        <w:t xml:space="preserve"> /</w:t>
+      </w:r>
+      <w:proofErr w:type="spellStart"/>
+      <w:r>
+        <w:t>api</w:t>
+      </w:r>
+      <w:proofErr w:type="spellEnd"/>
+      <w:r>
+        <w:t>/auth/</w:t>
+      </w:r>
+      <w:proofErr w:type="spellStart"/>
+      <w:r>
+        <w:t>termekModify</w:t>
+      </w:r>
+      <w:proofErr w:type="spellEnd"/>
+      <w:r>
+        <w:t xml:space="preserve">/:id - Modify an existing </w:t>
+      </w:r>
+      <w:proofErr w:type="spellStart"/>
+      <w:r>
+        <w:t>termék</w:t>
+      </w:r>
+      <w:proofErr w:type="spellEnd"/>
+      <w:r>
+        <w:t xml:space="preserve"> by ID</w:t>
+      </w:r>
+    </w:p>
+    <w:p>
+      <w:pPr>
+        <w:numPr>
+          <w:ilvl w:val="1"/>
+          <w:numId w:val="10"/>
+        </w:numPr>
+      </w:pPr>
+      <w:r>
+        <w:rPr>
+          <w:b/>
+          <w:bCs/>
+        </w:rPr>
+        <w:t>200</w:t>
+      </w:r>
+      <w:r>
+        <w:t> (OK) - Successful modification</w:t>
+      </w:r>
+    </w:p>
+    <w:p>
+      <w:pPr>
+        <w:numPr>
+          <w:ilvl w:val="1"/>
+          <w:numId w:val="10"/>
+        </w:numPr>
+      </w:pPr>
+      <w:r>
+        <w:rPr>
+          <w:b/>
+          <w:bCs/>
+        </w:rPr>
+        <w:t>400</w:t>
+      </w:r>
+      <w:r>
+        <w:t> (Bad Request) - Missing ID or no updates provided</w:t>
+      </w:r>
+    </w:p>
+    <w:p>
+      <w:pPr>
+        <w:numPr>
+          <w:ilvl w:val="1"/>
+          <w:numId w:val="10"/>
+        </w:numPr>
+      </w:pPr>
+      <w:r>
+        <w:rPr>
+          <w:b/>
+          <w:bCs/>
+        </w:rPr>
+        <w:t>404</w:t>
+      </w:r>
+      <w:r>
+        <w:t> (Not Found) - Product not found</w:t>
+      </w:r>
+    </w:p>
+    <w:p>
+      <w:pPr>
+        <w:numPr>
+          <w:ilvl w:val="1"/>
+          <w:numId w:val="10"/>
+        </w:numPr>
+      </w:pPr>
+      <w:r>
+        <w:rPr>
+          <w:b/>
+          <w:bCs/>
+        </w:rPr>
+        <w:t>500</w:t>
+      </w:r>
+      <w:r>
+        <w:t> (Internal Server Error) - Server error during modification</w:t>
+      </w:r>
+    </w:p>
+    <w:p>
+      <w:pPr>
+        <w:numPr>
+          <w:ilvl w:val="0"/>
+          <w:numId w:val="10"/>
+        </w:numPr>
+      </w:pPr>
+      <w:r>
+        <w:rPr>
+          <w:b/>
+          <w:bCs/>
+        </w:rPr>
+        <w:t>DELETE</w:t>
+      </w:r>
+      <w:r>
+        <w:t xml:space="preserve"> /</w:t>
+      </w:r>
+      <w:proofErr w:type="spellStart"/>
+      <w:r>
+        <w:t>api</w:t>
+      </w:r>
+      <w:proofErr w:type="spellEnd"/>
+      <w:r>
+        <w:t>/auth/</w:t>
+      </w:r>
+      <w:proofErr w:type="spellStart"/>
+      <w:r>
+        <w:t>termekDelete</w:t>
+      </w:r>
+      <w:proofErr w:type="spellEnd"/>
+      <w:r>
+        <w:t xml:space="preserve">/:id - Delete a </w:t>
+      </w:r>
+      <w:proofErr w:type="spellStart"/>
+      <w:r>
+        <w:t>termék</w:t>
+      </w:r>
+      <w:proofErr w:type="spellEnd"/>
+      <w:r>
+        <w:t xml:space="preserve"> by ID</w:t>
+      </w:r>
+    </w:p>
+    <w:p>
+      <w:pPr>
+        <w:numPr>
+          <w:ilvl w:val="1"/>
+          <w:numId w:val="10"/>
+        </w:numPr>
+      </w:pPr>
+      <w:r>
+        <w:rPr>
+          <w:b/>
+          <w:bCs/>
+        </w:rPr>
+        <w:t>200</w:t>
+      </w:r>
+      <w:r>
+        <w:t> (OK) - Successful deletion</w:t>
+      </w:r>
+    </w:p>
+    <w:p>
+      <w:pPr>
+        <w:numPr>
+          <w:ilvl w:val="1"/>
+          <w:numId w:val="10"/>
+        </w:numPr>
+      </w:pPr>
+      <w:r>
+        <w:rPr>
+          <w:b/>
+          <w:bCs/>
+        </w:rPr>
+        <w:t>400</w:t>
+      </w:r>
+      <w:r>
+        <w:t> (Bad Request) - Missing ID</w:t>
+      </w:r>
+    </w:p>
+    <w:p>
+      <w:pPr>
+        <w:numPr>
+          <w:ilvl w:val="1"/>
+          <w:numId w:val="10"/>
+        </w:numPr>
+      </w:pPr>
+      <w:r>
+        <w:rPr>
+          <w:b/>
+          <w:bCs/>
+        </w:rPr>
+        <w:t>404</w:t>
+      </w:r>
+      <w:r>
+        <w:t> (Not Found) - Product not found</w:t>
+      </w:r>
+    </w:p>
+    <w:p>
+      <w:pPr>
+        <w:numPr>
+          <w:ilvl w:val="1"/>
+          <w:numId w:val="10"/>
+        </w:numPr>
+      </w:pPr>
+      <w:r>
+        <w:rPr>
+          <w:b/>
+          <w:bCs/>
+        </w:rPr>
+        <w:t>500</w:t>
+      </w:r>
+      <w:r>
+        <w:t> (Internal Server Error) - Server error during deletion</w:t>
+      </w:r>
+    </w:p>
+    <w:p/>
     <w:sectPr>
       <w:pgSz w:w="12240" w:h="15840"/>
       <w:pgMar w:top="1440" w:right="1440" w:bottom="1440" w:left="1440" w:header="720" w:footer="720" w:gutter="0"/>
@@ -390,6 +2797,1531 @@
     </w:sectPr>
   </w:body>
 </w:document>
+</file>
+
+<file path=word/numbering.xml><?xml version="1.0" encoding="utf-8"?>
+<w:numbering xmlns:wpc="http://schemas.microsoft.com/office/word/2010/wordprocessingCanvas" xmlns:cx="http://schemas.microsoft.com/office/drawing/2014/chartex" xmlns:cx1="http://schemas.microsoft.com/office/drawing/2015/9/8/chartex" xmlns:cx2="http://schemas.microsoft.com/office/drawing/2015/10/21/chartex" xmlns:cx3="http://schemas.microsoft.com/office/drawing/2016/5/9/chartex" xmlns:cx4="http://schemas.microsoft.com/office/drawing/2016/5/10/chartex" xmlns:cx5="http://schemas.microsoft.com/office/drawing/2016/5/11/chartex" xmlns:cx6="http://schemas.microsoft.com/office/drawing/2016/5/12/chartex" xmlns:cx7="http://schemas.microsoft.com/office/drawing/2016/5/13/chartex" xmlns:cx8="http://schemas.microsoft.com/office/drawing/2016/5/14/chartex" xmlns:mc="http://schemas.openxmlformats.org/markup-compatibility/2006" xmlns:aink="http://schemas.microsoft.com/office/drawing/2016/ink" xmlns:am3d="http://schemas.microsoft.com/office/drawing/2017/model3d" xmlns:o="urn:schemas-microsoft-com:office:office" xmlns:oel="http://schemas.microsoft.com/office/2019/extlst" xmlns:r="http://schemas.openxmlformats.org/officeDocument/2006/relationships" xmlns:m="http://schemas.openxmlformats.org/officeDocument/2006/math" xmlns:v="urn:schemas-microsoft-com:vml" xmlns:wp14="http://schemas.microsoft.com/office/word/2010/wordprocessingDrawing" xmlns:wp="http://schemas.openxmlformats.org/drawingml/2006/wordprocessingDrawing" xmlns:w10="urn:schemas-microsoft-com:office:word" xmlns:w="http://schemas.openxmlformats.org/wordprocessingml/2006/main" xmlns:w14="http://schemas.microsoft.com/office/word/2010/wordml" xmlns:w15="http://schemas.microsoft.com/office/word/2012/wordml" xmlns:w16cex="http://schemas.microsoft.com/office/word/2018/wordml/cex" xmlns:w16cid="http://schemas.microsoft.com/office/word/2016/wordml/cid" xmlns:w16="http://schemas.microsoft.com/office/word/2018/wordml" xmlns:w16du="http://schemas.microsoft.com/office/word/2023/wordml/word16du" xmlns:w16sdtdh="http://schemas.microsoft.com/office/word/2020/wordml/sdtdatahash" xmlns:w16sdtfl="http://schemas.microsoft.com/office/word/2024/wordml/sdtformatlock" xmlns:w16se="http://schemas.microsoft.com/office/word/2015/wordml/symex" xmlns:wpg="http://schemas.microsoft.com/office/word/2010/wordprocessingGroup" xmlns:wpi="http://schemas.microsoft.com/office/word/2010/wordprocessingInk" xmlns:wne="http://schemas.microsoft.com/office/word/2006/wordml" xmlns:wps="http://schemas.microsoft.com/office/word/2010/wordprocessingShape" mc:Ignorable="w14 w15 w16se w16cid w16 w16cex w16sdtdh w16sdtfl w16du wp14">
+  <w:abstractNum w:abstractNumId="0" w15:restartNumberingAfterBreak="0">
+    <w:nsid w:val="012F270B"/>
+    <w:multiLevelType w:val="multilevel"/>
+    <w:tmpl w:val="3488B58A"/>
+    <w:lvl w:ilvl="0">
+      <w:start w:val="1"/>
+      <w:numFmt w:val="bullet"/>
+      <w:lvlText w:val=""/>
+      <w:lvlJc w:val="left"/>
+      <w:pPr>
+        <w:tabs>
+          <w:tab w:val="num" w:pos="720"/>
+        </w:tabs>
+        <w:ind w:left="720" w:hanging="360"/>
+      </w:pPr>
+      <w:rPr>
+        <w:rFonts w:ascii="Symbol" w:hAnsi="Symbol" w:hint="default"/>
+        <w:sz w:val="20"/>
+      </w:rPr>
+    </w:lvl>
+    <w:lvl w:ilvl="1">
+      <w:start w:val="1"/>
+      <w:numFmt w:val="bullet"/>
+      <w:lvlText w:val="o"/>
+      <w:lvlJc w:val="left"/>
+      <w:pPr>
+        <w:tabs>
+          <w:tab w:val="num" w:pos="1440"/>
+        </w:tabs>
+        <w:ind w:left="1440" w:hanging="360"/>
+      </w:pPr>
+      <w:rPr>
+        <w:rFonts w:ascii="Courier New" w:hAnsi="Courier New" w:hint="default"/>
+        <w:sz w:val="20"/>
+      </w:rPr>
+    </w:lvl>
+    <w:lvl w:ilvl="2" w:tentative="1">
+      <w:start w:val="1"/>
+      <w:numFmt w:val="bullet"/>
+      <w:lvlText w:val=""/>
+      <w:lvlJc w:val="left"/>
+      <w:pPr>
+        <w:tabs>
+          <w:tab w:val="num" w:pos="2160"/>
+        </w:tabs>
+        <w:ind w:left="2160" w:hanging="360"/>
+      </w:pPr>
+      <w:rPr>
+        <w:rFonts w:ascii="Wingdings" w:hAnsi="Wingdings" w:hint="default"/>
+        <w:sz w:val="20"/>
+      </w:rPr>
+    </w:lvl>
+    <w:lvl w:ilvl="3" w:tentative="1">
+      <w:start w:val="1"/>
+      <w:numFmt w:val="bullet"/>
+      <w:lvlText w:val=""/>
+      <w:lvlJc w:val="left"/>
+      <w:pPr>
+        <w:tabs>
+          <w:tab w:val="num" w:pos="2880"/>
+        </w:tabs>
+        <w:ind w:left="2880" w:hanging="360"/>
+      </w:pPr>
+      <w:rPr>
+        <w:rFonts w:ascii="Wingdings" w:hAnsi="Wingdings" w:hint="default"/>
+        <w:sz w:val="20"/>
+      </w:rPr>
+    </w:lvl>
+    <w:lvl w:ilvl="4" w:tentative="1">
+      <w:start w:val="1"/>
+      <w:numFmt w:val="bullet"/>
+      <w:lvlText w:val=""/>
+      <w:lvlJc w:val="left"/>
+      <w:pPr>
+        <w:tabs>
+          <w:tab w:val="num" w:pos="3600"/>
+        </w:tabs>
+        <w:ind w:left="3600" w:hanging="360"/>
+      </w:pPr>
+      <w:rPr>
+        <w:rFonts w:ascii="Wingdings" w:hAnsi="Wingdings" w:hint="default"/>
+        <w:sz w:val="20"/>
+      </w:rPr>
+    </w:lvl>
+    <w:lvl w:ilvl="5" w:tentative="1">
+      <w:start w:val="1"/>
+      <w:numFmt w:val="bullet"/>
+      <w:lvlText w:val=""/>
+      <w:lvlJc w:val="left"/>
+      <w:pPr>
+        <w:tabs>
+          <w:tab w:val="num" w:pos="4320"/>
+        </w:tabs>
+        <w:ind w:left="4320" w:hanging="360"/>
+      </w:pPr>
+      <w:rPr>
+        <w:rFonts w:ascii="Wingdings" w:hAnsi="Wingdings" w:hint="default"/>
+        <w:sz w:val="20"/>
+      </w:rPr>
+    </w:lvl>
+    <w:lvl w:ilvl="6" w:tentative="1">
+      <w:start w:val="1"/>
+      <w:numFmt w:val="bullet"/>
+      <w:lvlText w:val=""/>
+      <w:lvlJc w:val="left"/>
+      <w:pPr>
+        <w:tabs>
+          <w:tab w:val="num" w:pos="5040"/>
+        </w:tabs>
+        <w:ind w:left="5040" w:hanging="360"/>
+      </w:pPr>
+      <w:rPr>
+        <w:rFonts w:ascii="Wingdings" w:hAnsi="Wingdings" w:hint="default"/>
+        <w:sz w:val="20"/>
+      </w:rPr>
+    </w:lvl>
+    <w:lvl w:ilvl="7" w:tentative="1">
+      <w:start w:val="1"/>
+      <w:numFmt w:val="bullet"/>
+      <w:lvlText w:val=""/>
+      <w:lvlJc w:val="left"/>
+      <w:pPr>
+        <w:tabs>
+          <w:tab w:val="num" w:pos="5760"/>
+        </w:tabs>
+        <w:ind w:left="5760" w:hanging="360"/>
+      </w:pPr>
+      <w:rPr>
+        <w:rFonts w:ascii="Wingdings" w:hAnsi="Wingdings" w:hint="default"/>
+        <w:sz w:val="20"/>
+      </w:rPr>
+    </w:lvl>
+    <w:lvl w:ilvl="8" w:tentative="1">
+      <w:start w:val="1"/>
+      <w:numFmt w:val="bullet"/>
+      <w:lvlText w:val=""/>
+      <w:lvlJc w:val="left"/>
+      <w:pPr>
+        <w:tabs>
+          <w:tab w:val="num" w:pos="6480"/>
+        </w:tabs>
+        <w:ind w:left="6480" w:hanging="360"/>
+      </w:pPr>
+      <w:rPr>
+        <w:rFonts w:ascii="Wingdings" w:hAnsi="Wingdings" w:hint="default"/>
+        <w:sz w:val="20"/>
+      </w:rPr>
+    </w:lvl>
+  </w:abstractNum>
+  <w:abstractNum w:abstractNumId="1" w15:restartNumberingAfterBreak="0">
+    <w:nsid w:val="08BE1DD9"/>
+    <w:multiLevelType w:val="multilevel"/>
+    <w:tmpl w:val="7A406236"/>
+    <w:lvl w:ilvl="0">
+      <w:start w:val="1"/>
+      <w:numFmt w:val="bullet"/>
+      <w:lvlText w:val=""/>
+      <w:lvlJc w:val="left"/>
+      <w:pPr>
+        <w:tabs>
+          <w:tab w:val="num" w:pos="720"/>
+        </w:tabs>
+        <w:ind w:left="720" w:hanging="360"/>
+      </w:pPr>
+      <w:rPr>
+        <w:rFonts w:ascii="Symbol" w:hAnsi="Symbol" w:hint="default"/>
+        <w:sz w:val="20"/>
+      </w:rPr>
+    </w:lvl>
+    <w:lvl w:ilvl="1">
+      <w:start w:val="1"/>
+      <w:numFmt w:val="bullet"/>
+      <w:lvlText w:val="o"/>
+      <w:lvlJc w:val="left"/>
+      <w:pPr>
+        <w:tabs>
+          <w:tab w:val="num" w:pos="1440"/>
+        </w:tabs>
+        <w:ind w:left="1440" w:hanging="360"/>
+      </w:pPr>
+      <w:rPr>
+        <w:rFonts w:ascii="Courier New" w:hAnsi="Courier New" w:hint="default"/>
+        <w:sz w:val="20"/>
+      </w:rPr>
+    </w:lvl>
+    <w:lvl w:ilvl="2" w:tentative="1">
+      <w:start w:val="1"/>
+      <w:numFmt w:val="bullet"/>
+      <w:lvlText w:val=""/>
+      <w:lvlJc w:val="left"/>
+      <w:pPr>
+        <w:tabs>
+          <w:tab w:val="num" w:pos="2160"/>
+        </w:tabs>
+        <w:ind w:left="2160" w:hanging="360"/>
+      </w:pPr>
+      <w:rPr>
+        <w:rFonts w:ascii="Wingdings" w:hAnsi="Wingdings" w:hint="default"/>
+        <w:sz w:val="20"/>
+      </w:rPr>
+    </w:lvl>
+    <w:lvl w:ilvl="3" w:tentative="1">
+      <w:start w:val="1"/>
+      <w:numFmt w:val="bullet"/>
+      <w:lvlText w:val=""/>
+      <w:lvlJc w:val="left"/>
+      <w:pPr>
+        <w:tabs>
+          <w:tab w:val="num" w:pos="2880"/>
+        </w:tabs>
+        <w:ind w:left="2880" w:hanging="360"/>
+      </w:pPr>
+      <w:rPr>
+        <w:rFonts w:ascii="Wingdings" w:hAnsi="Wingdings" w:hint="default"/>
+        <w:sz w:val="20"/>
+      </w:rPr>
+    </w:lvl>
+    <w:lvl w:ilvl="4" w:tentative="1">
+      <w:start w:val="1"/>
+      <w:numFmt w:val="bullet"/>
+      <w:lvlText w:val=""/>
+      <w:lvlJc w:val="left"/>
+      <w:pPr>
+        <w:tabs>
+          <w:tab w:val="num" w:pos="3600"/>
+        </w:tabs>
+        <w:ind w:left="3600" w:hanging="360"/>
+      </w:pPr>
+      <w:rPr>
+        <w:rFonts w:ascii="Wingdings" w:hAnsi="Wingdings" w:hint="default"/>
+        <w:sz w:val="20"/>
+      </w:rPr>
+    </w:lvl>
+    <w:lvl w:ilvl="5" w:tentative="1">
+      <w:start w:val="1"/>
+      <w:numFmt w:val="bullet"/>
+      <w:lvlText w:val=""/>
+      <w:lvlJc w:val="left"/>
+      <w:pPr>
+        <w:tabs>
+          <w:tab w:val="num" w:pos="4320"/>
+        </w:tabs>
+        <w:ind w:left="4320" w:hanging="360"/>
+      </w:pPr>
+      <w:rPr>
+        <w:rFonts w:ascii="Wingdings" w:hAnsi="Wingdings" w:hint="default"/>
+        <w:sz w:val="20"/>
+      </w:rPr>
+    </w:lvl>
+    <w:lvl w:ilvl="6" w:tentative="1">
+      <w:start w:val="1"/>
+      <w:numFmt w:val="bullet"/>
+      <w:lvlText w:val=""/>
+      <w:lvlJc w:val="left"/>
+      <w:pPr>
+        <w:tabs>
+          <w:tab w:val="num" w:pos="5040"/>
+        </w:tabs>
+        <w:ind w:left="5040" w:hanging="360"/>
+      </w:pPr>
+      <w:rPr>
+        <w:rFonts w:ascii="Wingdings" w:hAnsi="Wingdings" w:hint="default"/>
+        <w:sz w:val="20"/>
+      </w:rPr>
+    </w:lvl>
+    <w:lvl w:ilvl="7" w:tentative="1">
+      <w:start w:val="1"/>
+      <w:numFmt w:val="bullet"/>
+      <w:lvlText w:val=""/>
+      <w:lvlJc w:val="left"/>
+      <w:pPr>
+        <w:tabs>
+          <w:tab w:val="num" w:pos="5760"/>
+        </w:tabs>
+        <w:ind w:left="5760" w:hanging="360"/>
+      </w:pPr>
+      <w:rPr>
+        <w:rFonts w:ascii="Wingdings" w:hAnsi="Wingdings" w:hint="default"/>
+        <w:sz w:val="20"/>
+      </w:rPr>
+    </w:lvl>
+    <w:lvl w:ilvl="8" w:tentative="1">
+      <w:start w:val="1"/>
+      <w:numFmt w:val="bullet"/>
+      <w:lvlText w:val=""/>
+      <w:lvlJc w:val="left"/>
+      <w:pPr>
+        <w:tabs>
+          <w:tab w:val="num" w:pos="6480"/>
+        </w:tabs>
+        <w:ind w:left="6480" w:hanging="360"/>
+      </w:pPr>
+      <w:rPr>
+        <w:rFonts w:ascii="Wingdings" w:hAnsi="Wingdings" w:hint="default"/>
+        <w:sz w:val="20"/>
+      </w:rPr>
+    </w:lvl>
+  </w:abstractNum>
+  <w:abstractNum w:abstractNumId="2" w15:restartNumberingAfterBreak="0">
+    <w:nsid w:val="0BEF70EB"/>
+    <w:multiLevelType w:val="multilevel"/>
+    <w:tmpl w:val="7C486AB4"/>
+    <w:lvl w:ilvl="0">
+      <w:start w:val="1"/>
+      <w:numFmt w:val="bullet"/>
+      <w:lvlText w:val=""/>
+      <w:lvlJc w:val="left"/>
+      <w:pPr>
+        <w:tabs>
+          <w:tab w:val="num" w:pos="720"/>
+        </w:tabs>
+        <w:ind w:left="720" w:hanging="360"/>
+      </w:pPr>
+      <w:rPr>
+        <w:rFonts w:ascii="Symbol" w:hAnsi="Symbol" w:hint="default"/>
+        <w:sz w:val="20"/>
+      </w:rPr>
+    </w:lvl>
+    <w:lvl w:ilvl="1">
+      <w:start w:val="1"/>
+      <w:numFmt w:val="bullet"/>
+      <w:lvlText w:val="o"/>
+      <w:lvlJc w:val="left"/>
+      <w:pPr>
+        <w:tabs>
+          <w:tab w:val="num" w:pos="1440"/>
+        </w:tabs>
+        <w:ind w:left="1440" w:hanging="360"/>
+      </w:pPr>
+      <w:rPr>
+        <w:rFonts w:ascii="Courier New" w:hAnsi="Courier New" w:hint="default"/>
+        <w:sz w:val="20"/>
+      </w:rPr>
+    </w:lvl>
+    <w:lvl w:ilvl="2" w:tentative="1">
+      <w:start w:val="1"/>
+      <w:numFmt w:val="bullet"/>
+      <w:lvlText w:val=""/>
+      <w:lvlJc w:val="left"/>
+      <w:pPr>
+        <w:tabs>
+          <w:tab w:val="num" w:pos="2160"/>
+        </w:tabs>
+        <w:ind w:left="2160" w:hanging="360"/>
+      </w:pPr>
+      <w:rPr>
+        <w:rFonts w:ascii="Wingdings" w:hAnsi="Wingdings" w:hint="default"/>
+        <w:sz w:val="20"/>
+      </w:rPr>
+    </w:lvl>
+    <w:lvl w:ilvl="3" w:tentative="1">
+      <w:start w:val="1"/>
+      <w:numFmt w:val="bullet"/>
+      <w:lvlText w:val=""/>
+      <w:lvlJc w:val="left"/>
+      <w:pPr>
+        <w:tabs>
+          <w:tab w:val="num" w:pos="2880"/>
+        </w:tabs>
+        <w:ind w:left="2880" w:hanging="360"/>
+      </w:pPr>
+      <w:rPr>
+        <w:rFonts w:ascii="Wingdings" w:hAnsi="Wingdings" w:hint="default"/>
+        <w:sz w:val="20"/>
+      </w:rPr>
+    </w:lvl>
+    <w:lvl w:ilvl="4" w:tentative="1">
+      <w:start w:val="1"/>
+      <w:numFmt w:val="bullet"/>
+      <w:lvlText w:val=""/>
+      <w:lvlJc w:val="left"/>
+      <w:pPr>
+        <w:tabs>
+          <w:tab w:val="num" w:pos="3600"/>
+        </w:tabs>
+        <w:ind w:left="3600" w:hanging="360"/>
+      </w:pPr>
+      <w:rPr>
+        <w:rFonts w:ascii="Wingdings" w:hAnsi="Wingdings" w:hint="default"/>
+        <w:sz w:val="20"/>
+      </w:rPr>
+    </w:lvl>
+    <w:lvl w:ilvl="5" w:tentative="1">
+      <w:start w:val="1"/>
+      <w:numFmt w:val="bullet"/>
+      <w:lvlText w:val=""/>
+      <w:lvlJc w:val="left"/>
+      <w:pPr>
+        <w:tabs>
+          <w:tab w:val="num" w:pos="4320"/>
+        </w:tabs>
+        <w:ind w:left="4320" w:hanging="360"/>
+      </w:pPr>
+      <w:rPr>
+        <w:rFonts w:ascii="Wingdings" w:hAnsi="Wingdings" w:hint="default"/>
+        <w:sz w:val="20"/>
+      </w:rPr>
+    </w:lvl>
+    <w:lvl w:ilvl="6" w:tentative="1">
+      <w:start w:val="1"/>
+      <w:numFmt w:val="bullet"/>
+      <w:lvlText w:val=""/>
+      <w:lvlJc w:val="left"/>
+      <w:pPr>
+        <w:tabs>
+          <w:tab w:val="num" w:pos="5040"/>
+        </w:tabs>
+        <w:ind w:left="5040" w:hanging="360"/>
+      </w:pPr>
+      <w:rPr>
+        <w:rFonts w:ascii="Wingdings" w:hAnsi="Wingdings" w:hint="default"/>
+        <w:sz w:val="20"/>
+      </w:rPr>
+    </w:lvl>
+    <w:lvl w:ilvl="7" w:tentative="1">
+      <w:start w:val="1"/>
+      <w:numFmt w:val="bullet"/>
+      <w:lvlText w:val=""/>
+      <w:lvlJc w:val="left"/>
+      <w:pPr>
+        <w:tabs>
+          <w:tab w:val="num" w:pos="5760"/>
+        </w:tabs>
+        <w:ind w:left="5760" w:hanging="360"/>
+      </w:pPr>
+      <w:rPr>
+        <w:rFonts w:ascii="Wingdings" w:hAnsi="Wingdings" w:hint="default"/>
+        <w:sz w:val="20"/>
+      </w:rPr>
+    </w:lvl>
+    <w:lvl w:ilvl="8" w:tentative="1">
+      <w:start w:val="1"/>
+      <w:numFmt w:val="bullet"/>
+      <w:lvlText w:val=""/>
+      <w:lvlJc w:val="left"/>
+      <w:pPr>
+        <w:tabs>
+          <w:tab w:val="num" w:pos="6480"/>
+        </w:tabs>
+        <w:ind w:left="6480" w:hanging="360"/>
+      </w:pPr>
+      <w:rPr>
+        <w:rFonts w:ascii="Wingdings" w:hAnsi="Wingdings" w:hint="default"/>
+        <w:sz w:val="20"/>
+      </w:rPr>
+    </w:lvl>
+  </w:abstractNum>
+  <w:abstractNum w:abstractNumId="3" w15:restartNumberingAfterBreak="0">
+    <w:nsid w:val="15D00755"/>
+    <w:multiLevelType w:val="multilevel"/>
+    <w:tmpl w:val="CDC0DCAA"/>
+    <w:lvl w:ilvl="0">
+      <w:start w:val="1"/>
+      <w:numFmt w:val="bullet"/>
+      <w:lvlText w:val=""/>
+      <w:lvlJc w:val="left"/>
+      <w:pPr>
+        <w:tabs>
+          <w:tab w:val="num" w:pos="720"/>
+        </w:tabs>
+        <w:ind w:left="720" w:hanging="360"/>
+      </w:pPr>
+      <w:rPr>
+        <w:rFonts w:ascii="Symbol" w:hAnsi="Symbol" w:hint="default"/>
+        <w:sz w:val="20"/>
+      </w:rPr>
+    </w:lvl>
+    <w:lvl w:ilvl="1" w:tentative="1">
+      <w:start w:val="1"/>
+      <w:numFmt w:val="bullet"/>
+      <w:lvlText w:val="o"/>
+      <w:lvlJc w:val="left"/>
+      <w:pPr>
+        <w:tabs>
+          <w:tab w:val="num" w:pos="1440"/>
+        </w:tabs>
+        <w:ind w:left="1440" w:hanging="360"/>
+      </w:pPr>
+      <w:rPr>
+        <w:rFonts w:ascii="Courier New" w:hAnsi="Courier New" w:hint="default"/>
+        <w:sz w:val="20"/>
+      </w:rPr>
+    </w:lvl>
+    <w:lvl w:ilvl="2" w:tentative="1">
+      <w:start w:val="1"/>
+      <w:numFmt w:val="bullet"/>
+      <w:lvlText w:val=""/>
+      <w:lvlJc w:val="left"/>
+      <w:pPr>
+        <w:tabs>
+          <w:tab w:val="num" w:pos="2160"/>
+        </w:tabs>
+        <w:ind w:left="2160" w:hanging="360"/>
+      </w:pPr>
+      <w:rPr>
+        <w:rFonts w:ascii="Wingdings" w:hAnsi="Wingdings" w:hint="default"/>
+        <w:sz w:val="20"/>
+      </w:rPr>
+    </w:lvl>
+    <w:lvl w:ilvl="3" w:tentative="1">
+      <w:start w:val="1"/>
+      <w:numFmt w:val="bullet"/>
+      <w:lvlText w:val=""/>
+      <w:lvlJc w:val="left"/>
+      <w:pPr>
+        <w:tabs>
+          <w:tab w:val="num" w:pos="2880"/>
+        </w:tabs>
+        <w:ind w:left="2880" w:hanging="360"/>
+      </w:pPr>
+      <w:rPr>
+        <w:rFonts w:ascii="Wingdings" w:hAnsi="Wingdings" w:hint="default"/>
+        <w:sz w:val="20"/>
+      </w:rPr>
+    </w:lvl>
+    <w:lvl w:ilvl="4" w:tentative="1">
+      <w:start w:val="1"/>
+      <w:numFmt w:val="bullet"/>
+      <w:lvlText w:val=""/>
+      <w:lvlJc w:val="left"/>
+      <w:pPr>
+        <w:tabs>
+          <w:tab w:val="num" w:pos="3600"/>
+        </w:tabs>
+        <w:ind w:left="3600" w:hanging="360"/>
+      </w:pPr>
+      <w:rPr>
+        <w:rFonts w:ascii="Wingdings" w:hAnsi="Wingdings" w:hint="default"/>
+        <w:sz w:val="20"/>
+      </w:rPr>
+    </w:lvl>
+    <w:lvl w:ilvl="5" w:tentative="1">
+      <w:start w:val="1"/>
+      <w:numFmt w:val="bullet"/>
+      <w:lvlText w:val=""/>
+      <w:lvlJc w:val="left"/>
+      <w:pPr>
+        <w:tabs>
+          <w:tab w:val="num" w:pos="4320"/>
+        </w:tabs>
+        <w:ind w:left="4320" w:hanging="360"/>
+      </w:pPr>
+      <w:rPr>
+        <w:rFonts w:ascii="Wingdings" w:hAnsi="Wingdings" w:hint="default"/>
+        <w:sz w:val="20"/>
+      </w:rPr>
+    </w:lvl>
+    <w:lvl w:ilvl="6" w:tentative="1">
+      <w:start w:val="1"/>
+      <w:numFmt w:val="bullet"/>
+      <w:lvlText w:val=""/>
+      <w:lvlJc w:val="left"/>
+      <w:pPr>
+        <w:tabs>
+          <w:tab w:val="num" w:pos="5040"/>
+        </w:tabs>
+        <w:ind w:left="5040" w:hanging="360"/>
+      </w:pPr>
+      <w:rPr>
+        <w:rFonts w:ascii="Wingdings" w:hAnsi="Wingdings" w:hint="default"/>
+        <w:sz w:val="20"/>
+      </w:rPr>
+    </w:lvl>
+    <w:lvl w:ilvl="7" w:tentative="1">
+      <w:start w:val="1"/>
+      <w:numFmt w:val="bullet"/>
+      <w:lvlText w:val=""/>
+      <w:lvlJc w:val="left"/>
+      <w:pPr>
+        <w:tabs>
+          <w:tab w:val="num" w:pos="5760"/>
+        </w:tabs>
+        <w:ind w:left="5760" w:hanging="360"/>
+      </w:pPr>
+      <w:rPr>
+        <w:rFonts w:ascii="Wingdings" w:hAnsi="Wingdings" w:hint="default"/>
+        <w:sz w:val="20"/>
+      </w:rPr>
+    </w:lvl>
+    <w:lvl w:ilvl="8" w:tentative="1">
+      <w:start w:val="1"/>
+      <w:numFmt w:val="bullet"/>
+      <w:lvlText w:val=""/>
+      <w:lvlJc w:val="left"/>
+      <w:pPr>
+        <w:tabs>
+          <w:tab w:val="num" w:pos="6480"/>
+        </w:tabs>
+        <w:ind w:left="6480" w:hanging="360"/>
+      </w:pPr>
+      <w:rPr>
+        <w:rFonts w:ascii="Wingdings" w:hAnsi="Wingdings" w:hint="default"/>
+        <w:sz w:val="20"/>
+      </w:rPr>
+    </w:lvl>
+  </w:abstractNum>
+  <w:abstractNum w:abstractNumId="4" w15:restartNumberingAfterBreak="0">
+    <w:nsid w:val="19E4052E"/>
+    <w:multiLevelType w:val="multilevel"/>
+    <w:tmpl w:val="BE4AD282"/>
+    <w:lvl w:ilvl="0">
+      <w:start w:val="1"/>
+      <w:numFmt w:val="bullet"/>
+      <w:lvlText w:val=""/>
+      <w:lvlJc w:val="left"/>
+      <w:pPr>
+        <w:tabs>
+          <w:tab w:val="num" w:pos="720"/>
+        </w:tabs>
+        <w:ind w:left="720" w:hanging="360"/>
+      </w:pPr>
+      <w:rPr>
+        <w:rFonts w:ascii="Symbol" w:hAnsi="Symbol" w:hint="default"/>
+        <w:sz w:val="20"/>
+      </w:rPr>
+    </w:lvl>
+    <w:lvl w:ilvl="1" w:tentative="1">
+      <w:start w:val="1"/>
+      <w:numFmt w:val="bullet"/>
+      <w:lvlText w:val="o"/>
+      <w:lvlJc w:val="left"/>
+      <w:pPr>
+        <w:tabs>
+          <w:tab w:val="num" w:pos="1440"/>
+        </w:tabs>
+        <w:ind w:left="1440" w:hanging="360"/>
+      </w:pPr>
+      <w:rPr>
+        <w:rFonts w:ascii="Courier New" w:hAnsi="Courier New" w:hint="default"/>
+        <w:sz w:val="20"/>
+      </w:rPr>
+    </w:lvl>
+    <w:lvl w:ilvl="2" w:tentative="1">
+      <w:start w:val="1"/>
+      <w:numFmt w:val="bullet"/>
+      <w:lvlText w:val=""/>
+      <w:lvlJc w:val="left"/>
+      <w:pPr>
+        <w:tabs>
+          <w:tab w:val="num" w:pos="2160"/>
+        </w:tabs>
+        <w:ind w:left="2160" w:hanging="360"/>
+      </w:pPr>
+      <w:rPr>
+        <w:rFonts w:ascii="Wingdings" w:hAnsi="Wingdings" w:hint="default"/>
+        <w:sz w:val="20"/>
+      </w:rPr>
+    </w:lvl>
+    <w:lvl w:ilvl="3" w:tentative="1">
+      <w:start w:val="1"/>
+      <w:numFmt w:val="bullet"/>
+      <w:lvlText w:val=""/>
+      <w:lvlJc w:val="left"/>
+      <w:pPr>
+        <w:tabs>
+          <w:tab w:val="num" w:pos="2880"/>
+        </w:tabs>
+        <w:ind w:left="2880" w:hanging="360"/>
+      </w:pPr>
+      <w:rPr>
+        <w:rFonts w:ascii="Wingdings" w:hAnsi="Wingdings" w:hint="default"/>
+        <w:sz w:val="20"/>
+      </w:rPr>
+    </w:lvl>
+    <w:lvl w:ilvl="4" w:tentative="1">
+      <w:start w:val="1"/>
+      <w:numFmt w:val="bullet"/>
+      <w:lvlText w:val=""/>
+      <w:lvlJc w:val="left"/>
+      <w:pPr>
+        <w:tabs>
+          <w:tab w:val="num" w:pos="3600"/>
+        </w:tabs>
+        <w:ind w:left="3600" w:hanging="360"/>
+      </w:pPr>
+      <w:rPr>
+        <w:rFonts w:ascii="Wingdings" w:hAnsi="Wingdings" w:hint="default"/>
+        <w:sz w:val="20"/>
+      </w:rPr>
+    </w:lvl>
+    <w:lvl w:ilvl="5" w:tentative="1">
+      <w:start w:val="1"/>
+      <w:numFmt w:val="bullet"/>
+      <w:lvlText w:val=""/>
+      <w:lvlJc w:val="left"/>
+      <w:pPr>
+        <w:tabs>
+          <w:tab w:val="num" w:pos="4320"/>
+        </w:tabs>
+        <w:ind w:left="4320" w:hanging="360"/>
+      </w:pPr>
+      <w:rPr>
+        <w:rFonts w:ascii="Wingdings" w:hAnsi="Wingdings" w:hint="default"/>
+        <w:sz w:val="20"/>
+      </w:rPr>
+    </w:lvl>
+    <w:lvl w:ilvl="6" w:tentative="1">
+      <w:start w:val="1"/>
+      <w:numFmt w:val="bullet"/>
+      <w:lvlText w:val=""/>
+      <w:lvlJc w:val="left"/>
+      <w:pPr>
+        <w:tabs>
+          <w:tab w:val="num" w:pos="5040"/>
+        </w:tabs>
+        <w:ind w:left="5040" w:hanging="360"/>
+      </w:pPr>
+      <w:rPr>
+        <w:rFonts w:ascii="Wingdings" w:hAnsi="Wingdings" w:hint="default"/>
+        <w:sz w:val="20"/>
+      </w:rPr>
+    </w:lvl>
+    <w:lvl w:ilvl="7" w:tentative="1">
+      <w:start w:val="1"/>
+      <w:numFmt w:val="bullet"/>
+      <w:lvlText w:val=""/>
+      <w:lvlJc w:val="left"/>
+      <w:pPr>
+        <w:tabs>
+          <w:tab w:val="num" w:pos="5760"/>
+        </w:tabs>
+        <w:ind w:left="5760" w:hanging="360"/>
+      </w:pPr>
+      <w:rPr>
+        <w:rFonts w:ascii="Wingdings" w:hAnsi="Wingdings" w:hint="default"/>
+        <w:sz w:val="20"/>
+      </w:rPr>
+    </w:lvl>
+    <w:lvl w:ilvl="8" w:tentative="1">
+      <w:start w:val="1"/>
+      <w:numFmt w:val="bullet"/>
+      <w:lvlText w:val=""/>
+      <w:lvlJc w:val="left"/>
+      <w:pPr>
+        <w:tabs>
+          <w:tab w:val="num" w:pos="6480"/>
+        </w:tabs>
+        <w:ind w:left="6480" w:hanging="360"/>
+      </w:pPr>
+      <w:rPr>
+        <w:rFonts w:ascii="Wingdings" w:hAnsi="Wingdings" w:hint="default"/>
+        <w:sz w:val="20"/>
+      </w:rPr>
+    </w:lvl>
+  </w:abstractNum>
+  <w:abstractNum w:abstractNumId="5" w15:restartNumberingAfterBreak="0">
+    <w:nsid w:val="1E2944C2"/>
+    <w:multiLevelType w:val="multilevel"/>
+    <w:tmpl w:val="0D003F86"/>
+    <w:lvl w:ilvl="0">
+      <w:start w:val="1"/>
+      <w:numFmt w:val="bullet"/>
+      <w:lvlText w:val=""/>
+      <w:lvlJc w:val="left"/>
+      <w:pPr>
+        <w:tabs>
+          <w:tab w:val="num" w:pos="720"/>
+        </w:tabs>
+        <w:ind w:left="720" w:hanging="360"/>
+      </w:pPr>
+      <w:rPr>
+        <w:rFonts w:ascii="Symbol" w:hAnsi="Symbol" w:hint="default"/>
+        <w:sz w:val="20"/>
+      </w:rPr>
+    </w:lvl>
+    <w:lvl w:ilvl="1" w:tentative="1">
+      <w:start w:val="1"/>
+      <w:numFmt w:val="bullet"/>
+      <w:lvlText w:val="o"/>
+      <w:lvlJc w:val="left"/>
+      <w:pPr>
+        <w:tabs>
+          <w:tab w:val="num" w:pos="1440"/>
+        </w:tabs>
+        <w:ind w:left="1440" w:hanging="360"/>
+      </w:pPr>
+      <w:rPr>
+        <w:rFonts w:ascii="Courier New" w:hAnsi="Courier New" w:hint="default"/>
+        <w:sz w:val="20"/>
+      </w:rPr>
+    </w:lvl>
+    <w:lvl w:ilvl="2" w:tentative="1">
+      <w:start w:val="1"/>
+      <w:numFmt w:val="bullet"/>
+      <w:lvlText w:val=""/>
+      <w:lvlJc w:val="left"/>
+      <w:pPr>
+        <w:tabs>
+          <w:tab w:val="num" w:pos="2160"/>
+        </w:tabs>
+        <w:ind w:left="2160" w:hanging="360"/>
+      </w:pPr>
+      <w:rPr>
+        <w:rFonts w:ascii="Wingdings" w:hAnsi="Wingdings" w:hint="default"/>
+        <w:sz w:val="20"/>
+      </w:rPr>
+    </w:lvl>
+    <w:lvl w:ilvl="3" w:tentative="1">
+      <w:start w:val="1"/>
+      <w:numFmt w:val="bullet"/>
+      <w:lvlText w:val=""/>
+      <w:lvlJc w:val="left"/>
+      <w:pPr>
+        <w:tabs>
+          <w:tab w:val="num" w:pos="2880"/>
+        </w:tabs>
+        <w:ind w:left="2880" w:hanging="360"/>
+      </w:pPr>
+      <w:rPr>
+        <w:rFonts w:ascii="Wingdings" w:hAnsi="Wingdings" w:hint="default"/>
+        <w:sz w:val="20"/>
+      </w:rPr>
+    </w:lvl>
+    <w:lvl w:ilvl="4" w:tentative="1">
+      <w:start w:val="1"/>
+      <w:numFmt w:val="bullet"/>
+      <w:lvlText w:val=""/>
+      <w:lvlJc w:val="left"/>
+      <w:pPr>
+        <w:tabs>
+          <w:tab w:val="num" w:pos="3600"/>
+        </w:tabs>
+        <w:ind w:left="3600" w:hanging="360"/>
+      </w:pPr>
+      <w:rPr>
+        <w:rFonts w:ascii="Wingdings" w:hAnsi="Wingdings" w:hint="default"/>
+        <w:sz w:val="20"/>
+      </w:rPr>
+    </w:lvl>
+    <w:lvl w:ilvl="5" w:tentative="1">
+      <w:start w:val="1"/>
+      <w:numFmt w:val="bullet"/>
+      <w:lvlText w:val=""/>
+      <w:lvlJc w:val="left"/>
+      <w:pPr>
+        <w:tabs>
+          <w:tab w:val="num" w:pos="4320"/>
+        </w:tabs>
+        <w:ind w:left="4320" w:hanging="360"/>
+      </w:pPr>
+      <w:rPr>
+        <w:rFonts w:ascii="Wingdings" w:hAnsi="Wingdings" w:hint="default"/>
+        <w:sz w:val="20"/>
+      </w:rPr>
+    </w:lvl>
+    <w:lvl w:ilvl="6" w:tentative="1">
+      <w:start w:val="1"/>
+      <w:numFmt w:val="bullet"/>
+      <w:lvlText w:val=""/>
+      <w:lvlJc w:val="left"/>
+      <w:pPr>
+        <w:tabs>
+          <w:tab w:val="num" w:pos="5040"/>
+        </w:tabs>
+        <w:ind w:left="5040" w:hanging="360"/>
+      </w:pPr>
+      <w:rPr>
+        <w:rFonts w:ascii="Wingdings" w:hAnsi="Wingdings" w:hint="default"/>
+        <w:sz w:val="20"/>
+      </w:rPr>
+    </w:lvl>
+    <w:lvl w:ilvl="7" w:tentative="1">
+      <w:start w:val="1"/>
+      <w:numFmt w:val="bullet"/>
+      <w:lvlText w:val=""/>
+      <w:lvlJc w:val="left"/>
+      <w:pPr>
+        <w:tabs>
+          <w:tab w:val="num" w:pos="5760"/>
+        </w:tabs>
+        <w:ind w:left="5760" w:hanging="360"/>
+      </w:pPr>
+      <w:rPr>
+        <w:rFonts w:ascii="Wingdings" w:hAnsi="Wingdings" w:hint="default"/>
+        <w:sz w:val="20"/>
+      </w:rPr>
+    </w:lvl>
+    <w:lvl w:ilvl="8" w:tentative="1">
+      <w:start w:val="1"/>
+      <w:numFmt w:val="bullet"/>
+      <w:lvlText w:val=""/>
+      <w:lvlJc w:val="left"/>
+      <w:pPr>
+        <w:tabs>
+          <w:tab w:val="num" w:pos="6480"/>
+        </w:tabs>
+        <w:ind w:left="6480" w:hanging="360"/>
+      </w:pPr>
+      <w:rPr>
+        <w:rFonts w:ascii="Wingdings" w:hAnsi="Wingdings" w:hint="default"/>
+        <w:sz w:val="20"/>
+      </w:rPr>
+    </w:lvl>
+  </w:abstractNum>
+  <w:abstractNum w:abstractNumId="6" w15:restartNumberingAfterBreak="0">
+    <w:nsid w:val="256C6696"/>
+    <w:multiLevelType w:val="multilevel"/>
+    <w:tmpl w:val="99667BF4"/>
+    <w:lvl w:ilvl="0">
+      <w:start w:val="1"/>
+      <w:numFmt w:val="bullet"/>
+      <w:lvlText w:val=""/>
+      <w:lvlJc w:val="left"/>
+      <w:pPr>
+        <w:tabs>
+          <w:tab w:val="num" w:pos="720"/>
+        </w:tabs>
+        <w:ind w:left="720" w:hanging="360"/>
+      </w:pPr>
+      <w:rPr>
+        <w:rFonts w:ascii="Symbol" w:hAnsi="Symbol" w:hint="default"/>
+        <w:sz w:val="20"/>
+      </w:rPr>
+    </w:lvl>
+    <w:lvl w:ilvl="1" w:tentative="1">
+      <w:start w:val="1"/>
+      <w:numFmt w:val="bullet"/>
+      <w:lvlText w:val="o"/>
+      <w:lvlJc w:val="left"/>
+      <w:pPr>
+        <w:tabs>
+          <w:tab w:val="num" w:pos="1440"/>
+        </w:tabs>
+        <w:ind w:left="1440" w:hanging="360"/>
+      </w:pPr>
+      <w:rPr>
+        <w:rFonts w:ascii="Courier New" w:hAnsi="Courier New" w:hint="default"/>
+        <w:sz w:val="20"/>
+      </w:rPr>
+    </w:lvl>
+    <w:lvl w:ilvl="2" w:tentative="1">
+      <w:start w:val="1"/>
+      <w:numFmt w:val="bullet"/>
+      <w:lvlText w:val=""/>
+      <w:lvlJc w:val="left"/>
+      <w:pPr>
+        <w:tabs>
+          <w:tab w:val="num" w:pos="2160"/>
+        </w:tabs>
+        <w:ind w:left="2160" w:hanging="360"/>
+      </w:pPr>
+      <w:rPr>
+        <w:rFonts w:ascii="Wingdings" w:hAnsi="Wingdings" w:hint="default"/>
+        <w:sz w:val="20"/>
+      </w:rPr>
+    </w:lvl>
+    <w:lvl w:ilvl="3" w:tentative="1">
+      <w:start w:val="1"/>
+      <w:numFmt w:val="bullet"/>
+      <w:lvlText w:val=""/>
+      <w:lvlJc w:val="left"/>
+      <w:pPr>
+        <w:tabs>
+          <w:tab w:val="num" w:pos="2880"/>
+        </w:tabs>
+        <w:ind w:left="2880" w:hanging="360"/>
+      </w:pPr>
+      <w:rPr>
+        <w:rFonts w:ascii="Wingdings" w:hAnsi="Wingdings" w:hint="default"/>
+        <w:sz w:val="20"/>
+      </w:rPr>
+    </w:lvl>
+    <w:lvl w:ilvl="4" w:tentative="1">
+      <w:start w:val="1"/>
+      <w:numFmt w:val="bullet"/>
+      <w:lvlText w:val=""/>
+      <w:lvlJc w:val="left"/>
+      <w:pPr>
+        <w:tabs>
+          <w:tab w:val="num" w:pos="3600"/>
+        </w:tabs>
+        <w:ind w:left="3600" w:hanging="360"/>
+      </w:pPr>
+      <w:rPr>
+        <w:rFonts w:ascii="Wingdings" w:hAnsi="Wingdings" w:hint="default"/>
+        <w:sz w:val="20"/>
+      </w:rPr>
+    </w:lvl>
+    <w:lvl w:ilvl="5" w:tentative="1">
+      <w:start w:val="1"/>
+      <w:numFmt w:val="bullet"/>
+      <w:lvlText w:val=""/>
+      <w:lvlJc w:val="left"/>
+      <w:pPr>
+        <w:tabs>
+          <w:tab w:val="num" w:pos="4320"/>
+        </w:tabs>
+        <w:ind w:left="4320" w:hanging="360"/>
+      </w:pPr>
+      <w:rPr>
+        <w:rFonts w:ascii="Wingdings" w:hAnsi="Wingdings" w:hint="default"/>
+        <w:sz w:val="20"/>
+      </w:rPr>
+    </w:lvl>
+    <w:lvl w:ilvl="6" w:tentative="1">
+      <w:start w:val="1"/>
+      <w:numFmt w:val="bullet"/>
+      <w:lvlText w:val=""/>
+      <w:lvlJc w:val="left"/>
+      <w:pPr>
+        <w:tabs>
+          <w:tab w:val="num" w:pos="5040"/>
+        </w:tabs>
+        <w:ind w:left="5040" w:hanging="360"/>
+      </w:pPr>
+      <w:rPr>
+        <w:rFonts w:ascii="Wingdings" w:hAnsi="Wingdings" w:hint="default"/>
+        <w:sz w:val="20"/>
+      </w:rPr>
+    </w:lvl>
+    <w:lvl w:ilvl="7" w:tentative="1">
+      <w:start w:val="1"/>
+      <w:numFmt w:val="bullet"/>
+      <w:lvlText w:val=""/>
+      <w:lvlJc w:val="left"/>
+      <w:pPr>
+        <w:tabs>
+          <w:tab w:val="num" w:pos="5760"/>
+        </w:tabs>
+        <w:ind w:left="5760" w:hanging="360"/>
+      </w:pPr>
+      <w:rPr>
+        <w:rFonts w:ascii="Wingdings" w:hAnsi="Wingdings" w:hint="default"/>
+        <w:sz w:val="20"/>
+      </w:rPr>
+    </w:lvl>
+    <w:lvl w:ilvl="8" w:tentative="1">
+      <w:start w:val="1"/>
+      <w:numFmt w:val="bullet"/>
+      <w:lvlText w:val=""/>
+      <w:lvlJc w:val="left"/>
+      <w:pPr>
+        <w:tabs>
+          <w:tab w:val="num" w:pos="6480"/>
+        </w:tabs>
+        <w:ind w:left="6480" w:hanging="360"/>
+      </w:pPr>
+      <w:rPr>
+        <w:rFonts w:ascii="Wingdings" w:hAnsi="Wingdings" w:hint="default"/>
+        <w:sz w:val="20"/>
+      </w:rPr>
+    </w:lvl>
+  </w:abstractNum>
+  <w:abstractNum w:abstractNumId="7" w15:restartNumberingAfterBreak="0">
+    <w:nsid w:val="2D652F6F"/>
+    <w:multiLevelType w:val="multilevel"/>
+    <w:tmpl w:val="F446DB48"/>
+    <w:lvl w:ilvl="0">
+      <w:start w:val="1"/>
+      <w:numFmt w:val="bullet"/>
+      <w:lvlText w:val=""/>
+      <w:lvlJc w:val="left"/>
+      <w:pPr>
+        <w:tabs>
+          <w:tab w:val="num" w:pos="720"/>
+        </w:tabs>
+        <w:ind w:left="720" w:hanging="360"/>
+      </w:pPr>
+      <w:rPr>
+        <w:rFonts w:ascii="Symbol" w:hAnsi="Symbol" w:hint="default"/>
+        <w:sz w:val="20"/>
+      </w:rPr>
+    </w:lvl>
+    <w:lvl w:ilvl="1" w:tentative="1">
+      <w:start w:val="1"/>
+      <w:numFmt w:val="bullet"/>
+      <w:lvlText w:val="o"/>
+      <w:lvlJc w:val="left"/>
+      <w:pPr>
+        <w:tabs>
+          <w:tab w:val="num" w:pos="1440"/>
+        </w:tabs>
+        <w:ind w:left="1440" w:hanging="360"/>
+      </w:pPr>
+      <w:rPr>
+        <w:rFonts w:ascii="Courier New" w:hAnsi="Courier New" w:hint="default"/>
+        <w:sz w:val="20"/>
+      </w:rPr>
+    </w:lvl>
+    <w:lvl w:ilvl="2" w:tentative="1">
+      <w:start w:val="1"/>
+      <w:numFmt w:val="bullet"/>
+      <w:lvlText w:val=""/>
+      <w:lvlJc w:val="left"/>
+      <w:pPr>
+        <w:tabs>
+          <w:tab w:val="num" w:pos="2160"/>
+        </w:tabs>
+        <w:ind w:left="2160" w:hanging="360"/>
+      </w:pPr>
+      <w:rPr>
+        <w:rFonts w:ascii="Wingdings" w:hAnsi="Wingdings" w:hint="default"/>
+        <w:sz w:val="20"/>
+      </w:rPr>
+    </w:lvl>
+    <w:lvl w:ilvl="3" w:tentative="1">
+      <w:start w:val="1"/>
+      <w:numFmt w:val="bullet"/>
+      <w:lvlText w:val=""/>
+      <w:lvlJc w:val="left"/>
+      <w:pPr>
+        <w:tabs>
+          <w:tab w:val="num" w:pos="2880"/>
+        </w:tabs>
+        <w:ind w:left="2880" w:hanging="360"/>
+      </w:pPr>
+      <w:rPr>
+        <w:rFonts w:ascii="Wingdings" w:hAnsi="Wingdings" w:hint="default"/>
+        <w:sz w:val="20"/>
+      </w:rPr>
+    </w:lvl>
+    <w:lvl w:ilvl="4" w:tentative="1">
+      <w:start w:val="1"/>
+      <w:numFmt w:val="bullet"/>
+      <w:lvlText w:val=""/>
+      <w:lvlJc w:val="left"/>
+      <w:pPr>
+        <w:tabs>
+          <w:tab w:val="num" w:pos="3600"/>
+        </w:tabs>
+        <w:ind w:left="3600" w:hanging="360"/>
+      </w:pPr>
+      <w:rPr>
+        <w:rFonts w:ascii="Wingdings" w:hAnsi="Wingdings" w:hint="default"/>
+        <w:sz w:val="20"/>
+      </w:rPr>
+    </w:lvl>
+    <w:lvl w:ilvl="5" w:tentative="1">
+      <w:start w:val="1"/>
+      <w:numFmt w:val="bullet"/>
+      <w:lvlText w:val=""/>
+      <w:lvlJc w:val="left"/>
+      <w:pPr>
+        <w:tabs>
+          <w:tab w:val="num" w:pos="4320"/>
+        </w:tabs>
+        <w:ind w:left="4320" w:hanging="360"/>
+      </w:pPr>
+      <w:rPr>
+        <w:rFonts w:ascii="Wingdings" w:hAnsi="Wingdings" w:hint="default"/>
+        <w:sz w:val="20"/>
+      </w:rPr>
+    </w:lvl>
+    <w:lvl w:ilvl="6" w:tentative="1">
+      <w:start w:val="1"/>
+      <w:numFmt w:val="bullet"/>
+      <w:lvlText w:val=""/>
+      <w:lvlJc w:val="left"/>
+      <w:pPr>
+        <w:tabs>
+          <w:tab w:val="num" w:pos="5040"/>
+        </w:tabs>
+        <w:ind w:left="5040" w:hanging="360"/>
+      </w:pPr>
+      <w:rPr>
+        <w:rFonts w:ascii="Wingdings" w:hAnsi="Wingdings" w:hint="default"/>
+        <w:sz w:val="20"/>
+      </w:rPr>
+    </w:lvl>
+    <w:lvl w:ilvl="7" w:tentative="1">
+      <w:start w:val="1"/>
+      <w:numFmt w:val="bullet"/>
+      <w:lvlText w:val=""/>
+      <w:lvlJc w:val="left"/>
+      <w:pPr>
+        <w:tabs>
+          <w:tab w:val="num" w:pos="5760"/>
+        </w:tabs>
+        <w:ind w:left="5760" w:hanging="360"/>
+      </w:pPr>
+      <w:rPr>
+        <w:rFonts w:ascii="Wingdings" w:hAnsi="Wingdings" w:hint="default"/>
+        <w:sz w:val="20"/>
+      </w:rPr>
+    </w:lvl>
+    <w:lvl w:ilvl="8" w:tentative="1">
+      <w:start w:val="1"/>
+      <w:numFmt w:val="bullet"/>
+      <w:lvlText w:val=""/>
+      <w:lvlJc w:val="left"/>
+      <w:pPr>
+        <w:tabs>
+          <w:tab w:val="num" w:pos="6480"/>
+        </w:tabs>
+        <w:ind w:left="6480" w:hanging="360"/>
+      </w:pPr>
+      <w:rPr>
+        <w:rFonts w:ascii="Wingdings" w:hAnsi="Wingdings" w:hint="default"/>
+        <w:sz w:val="20"/>
+      </w:rPr>
+    </w:lvl>
+  </w:abstractNum>
+  <w:abstractNum w:abstractNumId="8" w15:restartNumberingAfterBreak="0">
+    <w:nsid w:val="31C62EEF"/>
+    <w:multiLevelType w:val="multilevel"/>
+    <w:tmpl w:val="69AEA924"/>
+    <w:lvl w:ilvl="0">
+      <w:start w:val="1"/>
+      <w:numFmt w:val="bullet"/>
+      <w:lvlText w:val=""/>
+      <w:lvlJc w:val="left"/>
+      <w:pPr>
+        <w:tabs>
+          <w:tab w:val="num" w:pos="720"/>
+        </w:tabs>
+        <w:ind w:left="720" w:hanging="360"/>
+      </w:pPr>
+      <w:rPr>
+        <w:rFonts w:ascii="Symbol" w:hAnsi="Symbol" w:hint="default"/>
+        <w:sz w:val="20"/>
+      </w:rPr>
+    </w:lvl>
+    <w:lvl w:ilvl="1">
+      <w:start w:val="1"/>
+      <w:numFmt w:val="bullet"/>
+      <w:lvlText w:val="o"/>
+      <w:lvlJc w:val="left"/>
+      <w:pPr>
+        <w:tabs>
+          <w:tab w:val="num" w:pos="1440"/>
+        </w:tabs>
+        <w:ind w:left="1440" w:hanging="360"/>
+      </w:pPr>
+      <w:rPr>
+        <w:rFonts w:ascii="Courier New" w:hAnsi="Courier New" w:hint="default"/>
+        <w:sz w:val="20"/>
+      </w:rPr>
+    </w:lvl>
+    <w:lvl w:ilvl="2" w:tentative="1">
+      <w:start w:val="1"/>
+      <w:numFmt w:val="bullet"/>
+      <w:lvlText w:val=""/>
+      <w:lvlJc w:val="left"/>
+      <w:pPr>
+        <w:tabs>
+          <w:tab w:val="num" w:pos="2160"/>
+        </w:tabs>
+        <w:ind w:left="2160" w:hanging="360"/>
+      </w:pPr>
+      <w:rPr>
+        <w:rFonts w:ascii="Wingdings" w:hAnsi="Wingdings" w:hint="default"/>
+        <w:sz w:val="20"/>
+      </w:rPr>
+    </w:lvl>
+    <w:lvl w:ilvl="3" w:tentative="1">
+      <w:start w:val="1"/>
+      <w:numFmt w:val="bullet"/>
+      <w:lvlText w:val=""/>
+      <w:lvlJc w:val="left"/>
+      <w:pPr>
+        <w:tabs>
+          <w:tab w:val="num" w:pos="2880"/>
+        </w:tabs>
+        <w:ind w:left="2880" w:hanging="360"/>
+      </w:pPr>
+      <w:rPr>
+        <w:rFonts w:ascii="Wingdings" w:hAnsi="Wingdings" w:hint="default"/>
+        <w:sz w:val="20"/>
+      </w:rPr>
+    </w:lvl>
+    <w:lvl w:ilvl="4" w:tentative="1">
+      <w:start w:val="1"/>
+      <w:numFmt w:val="bullet"/>
+      <w:lvlText w:val=""/>
+      <w:lvlJc w:val="left"/>
+      <w:pPr>
+        <w:tabs>
+          <w:tab w:val="num" w:pos="3600"/>
+        </w:tabs>
+        <w:ind w:left="3600" w:hanging="360"/>
+      </w:pPr>
+      <w:rPr>
+        <w:rFonts w:ascii="Wingdings" w:hAnsi="Wingdings" w:hint="default"/>
+        <w:sz w:val="20"/>
+      </w:rPr>
+    </w:lvl>
+    <w:lvl w:ilvl="5" w:tentative="1">
+      <w:start w:val="1"/>
+      <w:numFmt w:val="bullet"/>
+      <w:lvlText w:val=""/>
+      <w:lvlJc w:val="left"/>
+      <w:pPr>
+        <w:tabs>
+          <w:tab w:val="num" w:pos="4320"/>
+        </w:tabs>
+        <w:ind w:left="4320" w:hanging="360"/>
+      </w:pPr>
+      <w:rPr>
+        <w:rFonts w:ascii="Wingdings" w:hAnsi="Wingdings" w:hint="default"/>
+        <w:sz w:val="20"/>
+      </w:rPr>
+    </w:lvl>
+    <w:lvl w:ilvl="6" w:tentative="1">
+      <w:start w:val="1"/>
+      <w:numFmt w:val="bullet"/>
+      <w:lvlText w:val=""/>
+      <w:lvlJc w:val="left"/>
+      <w:pPr>
+        <w:tabs>
+          <w:tab w:val="num" w:pos="5040"/>
+        </w:tabs>
+        <w:ind w:left="5040" w:hanging="360"/>
+      </w:pPr>
+      <w:rPr>
+        <w:rFonts w:ascii="Wingdings" w:hAnsi="Wingdings" w:hint="default"/>
+        <w:sz w:val="20"/>
+      </w:rPr>
+    </w:lvl>
+    <w:lvl w:ilvl="7" w:tentative="1">
+      <w:start w:val="1"/>
+      <w:numFmt w:val="bullet"/>
+      <w:lvlText w:val=""/>
+      <w:lvlJc w:val="left"/>
+      <w:pPr>
+        <w:tabs>
+          <w:tab w:val="num" w:pos="5760"/>
+        </w:tabs>
+        <w:ind w:left="5760" w:hanging="360"/>
+      </w:pPr>
+      <w:rPr>
+        <w:rFonts w:ascii="Wingdings" w:hAnsi="Wingdings" w:hint="default"/>
+        <w:sz w:val="20"/>
+      </w:rPr>
+    </w:lvl>
+    <w:lvl w:ilvl="8" w:tentative="1">
+      <w:start w:val="1"/>
+      <w:numFmt w:val="bullet"/>
+      <w:lvlText w:val=""/>
+      <w:lvlJc w:val="left"/>
+      <w:pPr>
+        <w:tabs>
+          <w:tab w:val="num" w:pos="6480"/>
+        </w:tabs>
+        <w:ind w:left="6480" w:hanging="360"/>
+      </w:pPr>
+      <w:rPr>
+        <w:rFonts w:ascii="Wingdings" w:hAnsi="Wingdings" w:hint="default"/>
+        <w:sz w:val="20"/>
+      </w:rPr>
+    </w:lvl>
+  </w:abstractNum>
+  <w:abstractNum w:abstractNumId="9" w15:restartNumberingAfterBreak="0">
+    <w:nsid w:val="39FA7180"/>
+    <w:multiLevelType w:val="multilevel"/>
+    <w:tmpl w:val="29AAE366"/>
+    <w:lvl w:ilvl="0">
+      <w:start w:val="1"/>
+      <w:numFmt w:val="bullet"/>
+      <w:lvlText w:val=""/>
+      <w:lvlJc w:val="left"/>
+      <w:pPr>
+        <w:tabs>
+          <w:tab w:val="num" w:pos="720"/>
+        </w:tabs>
+        <w:ind w:left="720" w:hanging="360"/>
+      </w:pPr>
+      <w:rPr>
+        <w:rFonts w:ascii="Symbol" w:hAnsi="Symbol" w:hint="default"/>
+        <w:sz w:val="20"/>
+      </w:rPr>
+    </w:lvl>
+    <w:lvl w:ilvl="1">
+      <w:start w:val="1"/>
+      <w:numFmt w:val="bullet"/>
+      <w:lvlText w:val="o"/>
+      <w:lvlJc w:val="left"/>
+      <w:pPr>
+        <w:tabs>
+          <w:tab w:val="num" w:pos="1440"/>
+        </w:tabs>
+        <w:ind w:left="1440" w:hanging="360"/>
+      </w:pPr>
+      <w:rPr>
+        <w:rFonts w:ascii="Courier New" w:hAnsi="Courier New" w:hint="default"/>
+        <w:sz w:val="20"/>
+      </w:rPr>
+    </w:lvl>
+    <w:lvl w:ilvl="2" w:tentative="1">
+      <w:start w:val="1"/>
+      <w:numFmt w:val="bullet"/>
+      <w:lvlText w:val=""/>
+      <w:lvlJc w:val="left"/>
+      <w:pPr>
+        <w:tabs>
+          <w:tab w:val="num" w:pos="2160"/>
+        </w:tabs>
+        <w:ind w:left="2160" w:hanging="360"/>
+      </w:pPr>
+      <w:rPr>
+        <w:rFonts w:ascii="Wingdings" w:hAnsi="Wingdings" w:hint="default"/>
+        <w:sz w:val="20"/>
+      </w:rPr>
+    </w:lvl>
+    <w:lvl w:ilvl="3" w:tentative="1">
+      <w:start w:val="1"/>
+      <w:numFmt w:val="bullet"/>
+      <w:lvlText w:val=""/>
+      <w:lvlJc w:val="left"/>
+      <w:pPr>
+        <w:tabs>
+          <w:tab w:val="num" w:pos="2880"/>
+        </w:tabs>
+        <w:ind w:left="2880" w:hanging="360"/>
+      </w:pPr>
+      <w:rPr>
+        <w:rFonts w:ascii="Wingdings" w:hAnsi="Wingdings" w:hint="default"/>
+        <w:sz w:val="20"/>
+      </w:rPr>
+    </w:lvl>
+    <w:lvl w:ilvl="4" w:tentative="1">
+      <w:start w:val="1"/>
+      <w:numFmt w:val="bullet"/>
+      <w:lvlText w:val=""/>
+      <w:lvlJc w:val="left"/>
+      <w:pPr>
+        <w:tabs>
+          <w:tab w:val="num" w:pos="3600"/>
+        </w:tabs>
+        <w:ind w:left="3600" w:hanging="360"/>
+      </w:pPr>
+      <w:rPr>
+        <w:rFonts w:ascii="Wingdings" w:hAnsi="Wingdings" w:hint="default"/>
+        <w:sz w:val="20"/>
+      </w:rPr>
+    </w:lvl>
+    <w:lvl w:ilvl="5" w:tentative="1">
+      <w:start w:val="1"/>
+      <w:numFmt w:val="bullet"/>
+      <w:lvlText w:val=""/>
+      <w:lvlJc w:val="left"/>
+      <w:pPr>
+        <w:tabs>
+          <w:tab w:val="num" w:pos="4320"/>
+        </w:tabs>
+        <w:ind w:left="4320" w:hanging="360"/>
+      </w:pPr>
+      <w:rPr>
+        <w:rFonts w:ascii="Wingdings" w:hAnsi="Wingdings" w:hint="default"/>
+        <w:sz w:val="20"/>
+      </w:rPr>
+    </w:lvl>
+    <w:lvl w:ilvl="6" w:tentative="1">
+      <w:start w:val="1"/>
+      <w:numFmt w:val="bullet"/>
+      <w:lvlText w:val=""/>
+      <w:lvlJc w:val="left"/>
+      <w:pPr>
+        <w:tabs>
+          <w:tab w:val="num" w:pos="5040"/>
+        </w:tabs>
+        <w:ind w:left="5040" w:hanging="360"/>
+      </w:pPr>
+      <w:rPr>
+        <w:rFonts w:ascii="Wingdings" w:hAnsi="Wingdings" w:hint="default"/>
+        <w:sz w:val="20"/>
+      </w:rPr>
+    </w:lvl>
+    <w:lvl w:ilvl="7" w:tentative="1">
+      <w:start w:val="1"/>
+      <w:numFmt w:val="bullet"/>
+      <w:lvlText w:val=""/>
+      <w:lvlJc w:val="left"/>
+      <w:pPr>
+        <w:tabs>
+          <w:tab w:val="num" w:pos="5760"/>
+        </w:tabs>
+        <w:ind w:left="5760" w:hanging="360"/>
+      </w:pPr>
+      <w:rPr>
+        <w:rFonts w:ascii="Wingdings" w:hAnsi="Wingdings" w:hint="default"/>
+        <w:sz w:val="20"/>
+      </w:rPr>
+    </w:lvl>
+    <w:lvl w:ilvl="8" w:tentative="1">
+      <w:start w:val="1"/>
+      <w:numFmt w:val="bullet"/>
+      <w:lvlText w:val=""/>
+      <w:lvlJc w:val="left"/>
+      <w:pPr>
+        <w:tabs>
+          <w:tab w:val="num" w:pos="6480"/>
+        </w:tabs>
+        <w:ind w:left="6480" w:hanging="360"/>
+      </w:pPr>
+      <w:rPr>
+        <w:rFonts w:ascii="Wingdings" w:hAnsi="Wingdings" w:hint="default"/>
+        <w:sz w:val="20"/>
+      </w:rPr>
+    </w:lvl>
+  </w:abstractNum>
+  <w:num w:numId="1" w16cid:durableId="121309601">
+    <w:abstractNumId w:val="7"/>
+  </w:num>
+  <w:num w:numId="2" w16cid:durableId="1089741292">
+    <w:abstractNumId w:val="4"/>
+  </w:num>
+  <w:num w:numId="3" w16cid:durableId="791436798">
+    <w:abstractNumId w:val="5"/>
+  </w:num>
+  <w:num w:numId="4" w16cid:durableId="220020620">
+    <w:abstractNumId w:val="3"/>
+  </w:num>
+  <w:num w:numId="5" w16cid:durableId="1673797440">
+    <w:abstractNumId w:val="6"/>
+  </w:num>
+  <w:num w:numId="6" w16cid:durableId="168253073">
+    <w:abstractNumId w:val="2"/>
+  </w:num>
+  <w:num w:numId="7" w16cid:durableId="691148160">
+    <w:abstractNumId w:val="9"/>
+  </w:num>
+  <w:num w:numId="8" w16cid:durableId="1869177165">
+    <w:abstractNumId w:val="0"/>
+  </w:num>
+  <w:num w:numId="9" w16cid:durableId="601383139">
+    <w:abstractNumId w:val="1"/>
+  </w:num>
+  <w:num w:numId="10" w16cid:durableId="697899215">
+    <w:abstractNumId w:val="8"/>
+  </w:num>
+</w:numbering>
 </file>
 
 <file path=word/styles.xml><?xml version="1.0" encoding="utf-8"?>

</xml_diff>